<commit_message>
hide reviews with a reason shown to the author, all-reviews page, course list shortcuts for tags and gaps, menu badges for pending records
Co-Authored-By: Claude Sonnet 5.5 <noreply@anthropic.com>
Claude-Session: https://claude.ai/code/session_01GT1iSHHmvFshTbyK6CNNWv
</commit_message>
<xml_diff>
--- a/docs/huong-dan-admin.docx
+++ b/docs/huong-dan-admin.docx
@@ -727,13 +727,13 @@
           <w:bCs/>
           <w:b/>
         </w:rPr>
-        <w:t xml:space="preserve">Khóa học &gt; Thiếu thuộc tính</w:t>
-      </w:r>
-      <w:r>
-        <w:t xml:space="preserve"> </w:t>
-      </w:r>
-      <w:r>
-        <w:t xml:space="preserve">liệt kê các khóa còn thiếu dữ liệu ở trên, kèm tên đối tác và số điện thoại để liên hệ bổ sung.</w:t>
+        <w:t xml:space="preserve">Thiếu thuộc tính</w:t>
+      </w:r>
+      <w:r>
+        <w:t xml:space="preserve"> </w:t>
+      </w:r>
+      <w:r>
+        <w:t xml:space="preserve">(nút ở đầu trang Khóa học) liệt kê các khóa còn thiếu dữ liệu ở trên, kèm tên đối tác và số điện thoại để liên hệ bổ sung.</w:t>
       </w:r>
       <w:r>
         <w:t xml:space="preserve"> </w:t>
@@ -1539,10 +1539,13 @@
           <w:bCs/>
           <w:b/>
         </w:rPr>
-        <w:t xml:space="preserve">Khóa học &gt; Tags</w:t>
-      </w:r>
-      <w:r>
-        <w:t xml:space="preserve">. Tag là danh mục kỹ năng/chủ đề có kiểm soát,</w:t>
+        <w:t xml:space="preserve">Tags</w:t>
+      </w:r>
+      <w:r>
+        <w:t xml:space="preserve"> </w:t>
+      </w:r>
+      <w:r>
+        <w:t xml:space="preserve">(nút ở đầu trang Khóa học). Tag là danh mục kỹ năng/chủ đề có kiểm soát,</w:t>
       </w:r>
       <w:r>
         <w:t xml:space="preserve"> </w:t>
@@ -2901,7 +2904,7 @@
         <w:t xml:space="preserve"> </w:t>
       </w:r>
       <w:r>
-        <w:t xml:space="preserve">Khóa học &gt; chọn khóa &gt; tab</w:t>
+        <w:t xml:space="preserve">có hai nơi. Trong từng khóa: Khóa học &gt; chọn khóa &gt; tab</w:t>
       </w:r>
       <w:r>
         <w:t xml:space="preserve"> </w:t>
@@ -2914,7 +2917,58 @@
         <w:t xml:space="preserve">Đánh giá</w:t>
       </w:r>
       <w:r>
-        <w:t xml:space="preserve">: cột "Xác thực" cho biết đã học thật hay chưa, công tắc</w:t>
+        <w:t xml:space="preserve">. Cho mọi khóa: trang</w:t>
+      </w:r>
+      <w:r>
+        <w:t xml:space="preserve"> </w:t>
+      </w:r>
+      <w:r>
+        <w:rPr>
+          <w:bCs/>
+          <w:b/>
+        </w:rPr>
+        <w:t xml:space="preserve">Khóa học</w:t>
+      </w:r>
+      <w:r>
+        <w:t xml:space="preserve">, nút</w:t>
+      </w:r>
+      <w:r>
+        <w:t xml:space="preserve"> </w:t>
+      </w:r>
+      <w:r>
+        <w:rPr>
+          <w:bCs/>
+          <w:b/>
+        </w:rPr>
+        <w:t xml:space="preserve">Xem tất cả đánh giá</w:t>
+      </w:r>
+      <w:r>
+        <w:t xml:space="preserve"> </w:t>
+      </w:r>
+      <w:r>
+        <w:t xml:space="preserve">(có bộ lọc Đang hiện / Đã ẩn / Đã ẩn và người viết đã sửa lại, và ô tìm theo khóa, người viết, nội dung). Cột "Xác thực" cho biết đã học thật hay chưa.</w:t>
+      </w:r>
+    </w:p>
+    <w:p>
+      <w:pPr>
+        <w:numPr>
+          <w:ilvl w:val="0"/>
+          <w:numId w:val="1018"/>
+        </w:numPr>
+        <w:pStyle w:val="Compact"/>
+      </w:pPr>
+      <w:r>
+        <w:rPr>
+          <w:bCs/>
+          <w:b/>
+        </w:rPr>
+        <w:t xml:space="preserve">Ẩn đánh giá:</w:t>
+      </w:r>
+      <w:r>
+        <w:t xml:space="preserve"> </w:t>
+      </w:r>
+      <w:r>
+        <w:t xml:space="preserve">tắt công tắc</w:t>
       </w:r>
       <w:r>
         <w:t xml:space="preserve"> </w:t>
@@ -2927,10 +2981,199 @@
         <w:t xml:space="preserve">Hiện</w:t>
       </w:r>
       <w:r>
-        <w:t xml:space="preserve"> </w:t>
-      </w:r>
-      <w:r>
-        <w:t xml:space="preserve">để ẩn hoặc hiện một đánh giá, nút xóa. Đánh giá bị ẩn biến khỏi trang khóa học, khỏi điểm trung bình của khóa và của đối tác (điểm xếp hạng cập nhật theo).</w:t>
+        <w:t xml:space="preserve">, hệ thống bắt buộc nhập</w:t>
+      </w:r>
+      <w:r>
+        <w:t xml:space="preserve"> </w:t>
+      </w:r>
+      <w:r>
+        <w:rPr>
+          <w:bCs/>
+          <w:b/>
+        </w:rPr>
+        <w:t xml:space="preserve">lý do</w:t>
+      </w:r>
+      <w:r>
+        <w:t xml:space="preserve"> </w:t>
+      </w:r>
+      <w:r>
+        <w:t xml:space="preserve">(ví dụ "nội dung chưa nói về khóa học"). Đánh giá biến khỏi trang khóa học, khỏi điểm trung bình của khóa và của đối tác. Người viết nhận thông báo kèm lý do; khi họ mở trang khóa, đánh giá của họ hiện</w:t>
+      </w:r>
+      <w:r>
+        <w:t xml:space="preserve"> </w:t>
+      </w:r>
+      <w:r>
+        <w:rPr>
+          <w:bCs/>
+          <w:b/>
+        </w:rPr>
+        <w:t xml:space="preserve">mờ</w:t>
+      </w:r>
+      <w:r>
+        <w:t xml:space="preserve">, kèm dòng "Đánh giá đang bị ẩn với lý do: …" và nút</w:t>
+      </w:r>
+      <w:r>
+        <w:t xml:space="preserve"> </w:t>
+      </w:r>
+      <w:r>
+        <w:rPr>
+          <w:bCs/>
+          <w:b/>
+        </w:rPr>
+        <w:t xml:space="preserve">Chỉnh sửa đánh giá</w:t>
+      </w:r>
+      <w:r>
+        <w:t xml:space="preserve">. Ẩn</w:t>
+      </w:r>
+      <w:r>
+        <w:t xml:space="preserve"> </w:t>
+      </w:r>
+      <w:r>
+        <w:rPr>
+          <w:bCs/>
+          <w:b/>
+        </w:rPr>
+        <w:t xml:space="preserve">không</w:t>
+      </w:r>
+      <w:r>
+        <w:t xml:space="preserve"> </w:t>
+      </w:r>
+      <w:r>
+        <w:t xml:space="preserve">thu hồi anyPoint.</w:t>
+      </w:r>
+    </w:p>
+    <w:p>
+      <w:pPr>
+        <w:numPr>
+          <w:ilvl w:val="0"/>
+          <w:numId w:val="1018"/>
+        </w:numPr>
+        <w:pStyle w:val="Compact"/>
+      </w:pPr>
+      <w:r>
+        <w:rPr>
+          <w:bCs/>
+          <w:b/>
+        </w:rPr>
+        <w:t xml:space="preserve">Người viết sửa lại:</w:t>
+      </w:r>
+      <w:r>
+        <w:t xml:space="preserve"> </w:t>
+      </w:r>
+      <w:r>
+        <w:t xml:space="preserve">admin nhận thông báo "{tên} đã chỉnh sửa đánh giá bị ẩn", dòng đó có nhãn cam "Người viết đã sửa lại, chờ xem" và nút</w:t>
+      </w:r>
+      <w:r>
+        <w:t xml:space="preserve"> </w:t>
+      </w:r>
+      <w:r>
+        <w:rPr>
+          <w:bCs/>
+          <w:b/>
+        </w:rPr>
+        <w:t xml:space="preserve">Xem tất cả đánh giá</w:t>
+      </w:r>
+      <w:r>
+        <w:t xml:space="preserve"> </w:t>
+      </w:r>
+      <w:r>
+        <w:t xml:space="preserve">hiện số đỏ. Admin xem lại và bật công tắc</w:t>
+      </w:r>
+      <w:r>
+        <w:t xml:space="preserve"> </w:t>
+      </w:r>
+      <w:r>
+        <w:rPr>
+          <w:bCs/>
+          <w:b/>
+        </w:rPr>
+        <w:t xml:space="preserve">Hiện</w:t>
+      </w:r>
+      <w:r>
+        <w:t xml:space="preserve"> </w:t>
+      </w:r>
+      <w:r>
+        <w:t xml:space="preserve">để mở lên (người viết nhận thông báo "đã được hiển thị"). Chưa đạt thì để nguyên hoặc ẩn lại với lý do mới.</w:t>
+      </w:r>
+    </w:p>
+    <w:p>
+      <w:pPr>
+        <w:numPr>
+          <w:ilvl w:val="0"/>
+          <w:numId w:val="1018"/>
+        </w:numPr>
+        <w:pStyle w:val="Compact"/>
+      </w:pPr>
+      <w:r>
+        <w:rPr>
+          <w:bCs/>
+          <w:b/>
+        </w:rPr>
+        <w:t xml:space="preserve">Xóa đánh giá:</w:t>
+      </w:r>
+      <w:r>
+        <w:t xml:space="preserve"> </w:t>
+      </w:r>
+      <w:r>
+        <w:t xml:space="preserve">xóa hẳn và</w:t>
+      </w:r>
+      <w:r>
+        <w:t xml:space="preserve"> </w:t>
+      </w:r>
+      <w:r>
+        <w:rPr>
+          <w:bCs/>
+          <w:b/>
+        </w:rPr>
+        <w:t xml:space="preserve">thu hồi anyPoint</w:t>
+      </w:r>
+      <w:r>
+        <w:t xml:space="preserve"> </w:t>
+      </w:r>
+      <w:r>
+        <w:t xml:space="preserve">đã thưởng (xem bên dưới).</w:t>
+      </w:r>
+    </w:p>
+    <w:p>
+      <w:pPr>
+        <w:pStyle w:val="FirstParagraph"/>
+      </w:pPr>
+      <w:r>
+        <w:rPr>
+          <w:bCs/>
+          <w:b/>
+        </w:rPr>
+        <w:t xml:space="preserve">Cần cấu hình:</w:t>
+      </w:r>
+      <w:r>
+        <w:t xml:space="preserve"> </w:t>
+      </w:r>
+      <w:r>
+        <w:t xml:space="preserve">ảnh đánh giá được lưu trên kho ảnh của hệ thống (biến</w:t>
+      </w:r>
+      <w:r>
+        <w:t xml:space="preserve"> </w:t>
+      </w:r>
+      <w:r>
+        <w:rPr>
+          <w:rStyle w:val="VerbatimChar"/>
+        </w:rPr>
+        <w:t xml:space="preserve">AWS_S3_BUCKET</w:t>
+      </w:r>
+      <w:r>
+        <w:t xml:space="preserve">,</w:t>
+      </w:r>
+      <w:r>
+        <w:t xml:space="preserve"> </w:t>
+      </w:r>
+      <w:r>
+        <w:rPr>
+          <w:rStyle w:val="VerbatimChar"/>
+        </w:rPr>
+        <w:t xml:space="preserve">AWS_ACCESS_KEY</w:t>
+      </w:r>
+      <w:r>
+        <w:t xml:space="preserve">... mục 11). Chưa cấu hình thì phụ huynh vẫn viết đánh giá được nhưng không tải ảnh lên được.</w:t>
       </w:r>
     </w:p>
     <w:p>
@@ -2942,37 +3185,42 @@
           <w:bCs/>
           <w:b/>
         </w:rPr>
-        <w:t xml:space="preserve">Cần cấu hình:</w:t>
-      </w:r>
-      <w:r>
-        <w:t xml:space="preserve"> </w:t>
-      </w:r>
-      <w:r>
-        <w:t xml:space="preserve">ảnh đánh giá được lưu trên kho ảnh của hệ thống (biến</w:t>
-      </w:r>
-      <w:r>
-        <w:t xml:space="preserve"> </w:t>
-      </w:r>
-      <w:r>
-        <w:rPr>
-          <w:rStyle w:val="VerbatimChar"/>
-        </w:rPr>
-        <w:t xml:space="preserve">AWS_S3_BUCKET</w:t>
-      </w:r>
-      <w:r>
-        <w:t xml:space="preserve">,</w:t>
-      </w:r>
-      <w:r>
-        <w:t xml:space="preserve"> </w:t>
-      </w:r>
-      <w:r>
-        <w:rPr>
-          <w:rStyle w:val="VerbatimChar"/>
-        </w:rPr>
-        <w:t xml:space="preserve">AWS_ACCESS_KEY</w:t>
-      </w:r>
-      <w:r>
-        <w:t xml:space="preserve">... mục 11). Chưa cấu hình thì phụ huynh vẫn viết đánh giá được nhưng không tải ảnh lên được.</w:t>
+        <w:t xml:space="preserve">Nhắc viết đánh giá:</w:t>
+      </w:r>
+      <w:r>
+        <w:t xml:space="preserve"> </w:t>
+      </w:r>
+      <w:r>
+        <w:t xml:space="preserve">hệ thống mỗi giờ quét các đơn đã giao và gửi thông báo (trong app và push) cho người mua chưa đánh giá khóa đó, hai lần: khi bé học được</w:t>
+      </w:r>
+      <w:r>
+        <w:t xml:space="preserve"> </w:t>
+      </w:r>
+      <w:r>
+        <w:rPr>
+          <w:bCs/>
+          <w:b/>
+        </w:rPr>
+        <w:t xml:space="preserve">nửa khóa</w:t>
+      </w:r>
+      <w:r>
+        <w:t xml:space="preserve"> </w:t>
+      </w:r>
+      <w:r>
+        <w:t xml:space="preserve">và khi</w:t>
+      </w:r>
+      <w:r>
+        <w:t xml:space="preserve"> </w:t>
+      </w:r>
+      <w:r>
+        <w:rPr>
+          <w:bCs/>
+          <w:b/>
+        </w:rPr>
+        <w:t xml:space="preserve">khóa kết thúc</w:t>
+      </w:r>
+      <w:r>
+        <w:t xml:space="preserve">. Khóa không có ngày kết thúc được tính là kết thúc sau 30 ngày kể từ ngày bắt đầu. Mỗi mốc chỉ gửi một lần; không gửi cho khóa đã kết thúc quá 14 ngày (để lần chạy đầu không nhắn hàng loạt đơn cũ). Tắt/bật ở Cài đặt &gt; Vận hành &gt; Đánh giá khóa học.</w:t>
       </w:r>
     </w:p>
     <w:p>
@@ -2984,53 +3232,6 @@
           <w:bCs/>
           <w:b/>
         </w:rPr>
-        <w:t xml:space="preserve">Nhắc viết đánh giá:</w:t>
-      </w:r>
-      <w:r>
-        <w:t xml:space="preserve"> </w:t>
-      </w:r>
-      <w:r>
-        <w:t xml:space="preserve">hệ thống mỗi giờ quét các đơn đã giao và gửi thông báo (trong app và push) cho người mua chưa đánh giá khóa đó, hai lần: khi bé học được</w:t>
-      </w:r>
-      <w:r>
-        <w:t xml:space="preserve"> </w:t>
-      </w:r>
-      <w:r>
-        <w:rPr>
-          <w:bCs/>
-          <w:b/>
-        </w:rPr>
-        <w:t xml:space="preserve">nửa khóa</w:t>
-      </w:r>
-      <w:r>
-        <w:t xml:space="preserve"> </w:t>
-      </w:r>
-      <w:r>
-        <w:t xml:space="preserve">và khi</w:t>
-      </w:r>
-      <w:r>
-        <w:t xml:space="preserve"> </w:t>
-      </w:r>
-      <w:r>
-        <w:rPr>
-          <w:bCs/>
-          <w:b/>
-        </w:rPr>
-        <w:t xml:space="preserve">khóa kết thúc</w:t>
-      </w:r>
-      <w:r>
-        <w:t xml:space="preserve">. Khóa không có ngày kết thúc được tính là kết thúc sau 30 ngày kể từ ngày bắt đầu. Mỗi mốc chỉ gửi một lần; không gửi cho khóa đã kết thúc quá 14 ngày (để lần chạy đầu không nhắn hàng loạt đơn cũ). Tắt/bật ở Cài đặt &gt; Vận hành &gt; Đánh giá khóa học.</w:t>
-      </w:r>
-    </w:p>
-    <w:p>
-      <w:pPr>
-        <w:pStyle w:val="BodyText"/>
-      </w:pPr>
-      <w:r>
-        <w:rPr>
-          <w:bCs/>
-          <w:b/>
-        </w:rPr>
         <w:t xml:space="preserve">Thưởng anyPoint khi đánh giá:</w:t>
       </w:r>
       <w:r>
@@ -3063,13 +3264,13 @@
           <w:bCs/>
           <w:b/>
         </w:rPr>
-        <w:t xml:space="preserve">Admin ẩn hoặc xóa đánh giá thì anyPoint đã thưởng bị thu hồi</w:t>
-      </w:r>
-      <w:r>
-        <w:t xml:space="preserve"> </w:t>
-      </w:r>
-      <w:r>
-        <w:t xml:space="preserve">(ghi "Thu hồi anyPoint thưởng đánh giá"); nếu phụ huynh đã tiêu bớt thì chỉ thu phần còn lại, số dư không âm. Đánh giá đã bị ẩn rồi hiện lại thì không được thưởng lần nữa. Giao dịch nằm ở Giao dịch với loại</w:t>
+        <w:t xml:space="preserve">Admin xóa đánh giá thì anyPoint đã thưởng bị thu hồi</w:t>
+      </w:r>
+      <w:r>
+        <w:t xml:space="preserve"> </w:t>
+      </w:r>
+      <w:r>
+        <w:t xml:space="preserve">(ghi "Thu hồi anyPoint thưởng đánh giá"); nếu phụ huynh đã tiêu bớt thì chỉ thu phần còn lại, số dư không âm. Chỉ ẩn thì không thu hồi. Giao dịch nằm ở trang anyPoints với loại</w:t>
       </w:r>
       <w:r>
         <w:t xml:space="preserve"> </w:t>
@@ -3544,7 +3745,7 @@
       <w:pPr>
         <w:numPr>
           <w:ilvl w:val="0"/>
-          <w:numId w:val="1018"/>
+          <w:numId w:val="1019"/>
         </w:numPr>
         <w:pStyle w:val="Compact"/>
       </w:pPr>
@@ -3566,7 +3767,7 @@
       <w:pPr>
         <w:numPr>
           <w:ilvl w:val="0"/>
-          <w:numId w:val="1018"/>
+          <w:numId w:val="1019"/>
         </w:numPr>
         <w:pStyle w:val="Compact"/>
       </w:pPr>
@@ -3585,7 +3786,7 @@
       <w:pPr>
         <w:numPr>
           <w:ilvl w:val="0"/>
-          <w:numId w:val="1018"/>
+          <w:numId w:val="1019"/>
         </w:numPr>
         <w:pStyle w:val="Compact"/>
       </w:pPr>
@@ -3632,7 +3833,7 @@
       <w:pPr>
         <w:numPr>
           <w:ilvl w:val="0"/>
-          <w:numId w:val="1019"/>
+          <w:numId w:val="1020"/>
         </w:numPr>
         <w:pStyle w:val="Compact"/>
       </w:pPr>
@@ -3654,7 +3855,7 @@
       <w:pPr>
         <w:numPr>
           <w:ilvl w:val="0"/>
-          <w:numId w:val="1019"/>
+          <w:numId w:val="1020"/>
         </w:numPr>
         <w:pStyle w:val="Compact"/>
       </w:pPr>
@@ -3691,7 +3892,7 @@
       <w:pPr>
         <w:numPr>
           <w:ilvl w:val="0"/>
-          <w:numId w:val="1019"/>
+          <w:numId w:val="1020"/>
         </w:numPr>
         <w:pStyle w:val="Compact"/>
       </w:pPr>
@@ -3710,7 +3911,7 @@
       <w:pPr>
         <w:numPr>
           <w:ilvl w:val="0"/>
-          <w:numId w:val="1019"/>
+          <w:numId w:val="1020"/>
         </w:numPr>
         <w:pStyle w:val="Compact"/>
       </w:pPr>
@@ -3738,7 +3939,125 @@
       <w:pPr>
         <w:numPr>
           <w:ilvl w:val="0"/>
-          <w:numId w:val="1019"/>
+          <w:numId w:val="1020"/>
+        </w:numPr>
+        <w:pStyle w:val="Compact"/>
+      </w:pPr>
+      <w:r>
+        <w:rPr>
+          <w:bCs/>
+          <w:b/>
+        </w:rPr>
+        <w:t xml:space="preserve">Số đỏ trên menu:</w:t>
+      </w:r>
+      <w:r>
+        <w:t xml:space="preserve"> </w:t>
+      </w:r>
+      <w:r>
+        <w:t xml:space="preserve">các mục</w:t>
+      </w:r>
+      <w:r>
+        <w:t xml:space="preserve"> </w:t>
+      </w:r>
+      <w:r>
+        <w:rPr>
+          <w:bCs/>
+          <w:b/>
+        </w:rPr>
+        <w:t xml:space="preserve">Đơn hàng</w:t>
+      </w:r>
+      <w:r>
+        <w:t xml:space="preserve"> </w:t>
+      </w:r>
+      <w:r>
+        <w:t xml:space="preserve">(đơn khách đã bấm thanh toán, đang chờ),</w:t>
+      </w:r>
+      <w:r>
+        <w:t xml:space="preserve"> </w:t>
+      </w:r>
+      <w:r>
+        <w:rPr>
+          <w:bCs/>
+          <w:b/>
+        </w:rPr>
+        <w:t xml:space="preserve">anyPoints</w:t>
+      </w:r>
+      <w:r>
+        <w:t xml:space="preserve"> </w:t>
+      </w:r>
+      <w:r>
+        <w:t xml:space="preserve">(nạp/rút đang chờ duyệt),</w:t>
+      </w:r>
+      <w:r>
+        <w:t xml:space="preserve"> </w:t>
+      </w:r>
+      <w:r>
+        <w:rPr>
+          <w:bCs/>
+          <w:b/>
+        </w:rPr>
+        <w:t xml:space="preserve">Hoạt động</w:t>
+      </w:r>
+      <w:r>
+        <w:t xml:space="preserve"> </w:t>
+      </w:r>
+      <w:r>
+        <w:t xml:space="preserve">(đăng ký chưa duyệt),</w:t>
+      </w:r>
+      <w:r>
+        <w:t xml:space="preserve"> </w:t>
+      </w:r>
+      <w:r>
+        <w:rPr>
+          <w:bCs/>
+          <w:b/>
+        </w:rPr>
+        <w:t xml:space="preserve">Nghỉ / đổi lịch</w:t>
+      </w:r>
+      <w:r>
+        <w:t xml:space="preserve"> </w:t>
+      </w:r>
+      <w:r>
+        <w:t xml:space="preserve">(yêu cầu chờ xử lý),</w:t>
+      </w:r>
+      <w:r>
+        <w:t xml:space="preserve"> </w:t>
+      </w:r>
+      <w:r>
+        <w:rPr>
+          <w:bCs/>
+          <w:b/>
+        </w:rPr>
+        <w:t xml:space="preserve">Nhờ tìm khóa học</w:t>
+      </w:r>
+      <w:r>
+        <w:t xml:space="preserve"> </w:t>
+      </w:r>
+      <w:r>
+        <w:t xml:space="preserve">(yêu cầu mới) và</w:t>
+      </w:r>
+      <w:r>
+        <w:t xml:space="preserve"> </w:t>
+      </w:r>
+      <w:r>
+        <w:rPr>
+          <w:bCs/>
+          <w:b/>
+        </w:rPr>
+        <w:t xml:space="preserve">Báo giá rẻ hơn</w:t>
+      </w:r>
+      <w:r>
+        <w:t xml:space="preserve"> </w:t>
+      </w:r>
+      <w:r>
+        <w:t xml:space="preserve">(báo cáo mới) hiện số bản ghi chưa xử lý; số tự cập nhật mỗi phút và mỗi khi chuyển trang. Hết việc thì số biến mất.</w:t>
+      </w:r>
+    </w:p>
+    <w:p>
+      <w:pPr>
+        <w:numPr>
+          <w:ilvl w:val="0"/>
+          <w:numId w:val="1020"/>
         </w:numPr>
         <w:pStyle w:val="Compact"/>
       </w:pPr>
@@ -3775,7 +4094,7 @@
       <w:pPr>
         <w:numPr>
           <w:ilvl w:val="0"/>
-          <w:numId w:val="1019"/>
+          <w:numId w:val="1020"/>
         </w:numPr>
         <w:pStyle w:val="Compact"/>
       </w:pPr>
@@ -3812,7 +4131,7 @@
       <w:pPr>
         <w:numPr>
           <w:ilvl w:val="0"/>
-          <w:numId w:val="1019"/>
+          <w:numId w:val="1020"/>
         </w:numPr>
         <w:pStyle w:val="Compact"/>
       </w:pPr>
@@ -3849,7 +4168,7 @@
       <w:pPr>
         <w:numPr>
           <w:ilvl w:val="0"/>
-          <w:numId w:val="1019"/>
+          <w:numId w:val="1020"/>
         </w:numPr>
         <w:pStyle w:val="Compact"/>
       </w:pPr>
@@ -3871,7 +4190,7 @@
       <w:pPr>
         <w:numPr>
           <w:ilvl w:val="0"/>
-          <w:numId w:val="1019"/>
+          <w:numId w:val="1020"/>
         </w:numPr>
         <w:pStyle w:val="Compact"/>
       </w:pPr>
@@ -3945,7 +4264,7 @@
       <w:pPr>
         <w:numPr>
           <w:ilvl w:val="0"/>
-          <w:numId w:val="1020"/>
+          <w:numId w:val="1021"/>
         </w:numPr>
         <w:pStyle w:val="Compact"/>
       </w:pPr>
@@ -3957,7 +4276,7 @@
       <w:pPr>
         <w:numPr>
           <w:ilvl w:val="0"/>
-          <w:numId w:val="1020"/>
+          <w:numId w:val="1021"/>
         </w:numPr>
         <w:pStyle w:val="Compact"/>
       </w:pPr>
@@ -3981,173 +4300,173 @@
       <w:pPr>
         <w:numPr>
           <w:ilvl w:val="1"/>
+          <w:numId w:val="1022"/>
+        </w:numPr>
+        <w:pStyle w:val="Compact"/>
+      </w:pPr>
+      <w:r>
+        <w:rPr>
+          <w:rStyle w:val="VerbatimChar"/>
+        </w:rPr>
+        <w:t xml:space="preserve">GOOGLE_MAPS_API_KEY</w:t>
+      </w:r>
+      <w:r>
+        <w:t xml:space="preserve">: bật nút Tìm tự động ở địa chỉ. Bật Places API (New) trên Google Cloud. Không có key thì chỉ nhập tay được.</w:t>
+      </w:r>
+    </w:p>
+    <w:p>
+      <w:pPr>
+        <w:numPr>
+          <w:ilvl w:val="1"/>
+          <w:numId w:val="1022"/>
+        </w:numPr>
+        <w:pStyle w:val="Compact"/>
+      </w:pPr>
+      <w:r>
+        <w:rPr>
+          <w:rStyle w:val="VerbatimChar"/>
+        </w:rPr>
+        <w:t xml:space="preserve">SEPAY_API_KEY</w:t>
+      </w:r>
+      <w:r>
+        <w:t xml:space="preserve">: webhook nhận tiền chuyển khoản.</w:t>
+      </w:r>
+    </w:p>
+    <w:p>
+      <w:pPr>
+        <w:numPr>
+          <w:ilvl w:val="1"/>
+          <w:numId w:val="1022"/>
+        </w:numPr>
+        <w:pStyle w:val="Compact"/>
+      </w:pPr>
+      <w:r>
+        <w:rPr>
+          <w:rStyle w:val="VerbatimChar"/>
+        </w:rPr>
+        <w:t xml:space="preserve">VAPID_PUBLIC_KEY</w:t>
+      </w:r>
+      <w:r>
+        <w:t xml:space="preserve">,</w:t>
+      </w:r>
+      <w:r>
+        <w:t xml:space="preserve"> </w:t>
+      </w:r>
+      <w:r>
+        <w:rPr>
+          <w:rStyle w:val="VerbatimChar"/>
+        </w:rPr>
+        <w:t xml:space="preserve">VAPID_PRIVATE_KEY</w:t>
+      </w:r>
+      <w:r>
+        <w:t xml:space="preserve">: thông báo đẩy trên điện thoại. Tạo một lần và không đổi.</w:t>
+      </w:r>
+    </w:p>
+    <w:p>
+      <w:pPr>
+        <w:numPr>
+          <w:ilvl w:val="1"/>
+          <w:numId w:val="1022"/>
+        </w:numPr>
+        <w:pStyle w:val="Compact"/>
+      </w:pPr>
+      <w:r>
+        <w:rPr>
+          <w:rStyle w:val="VerbatimChar"/>
+        </w:rPr>
+        <w:t xml:space="preserve">JWT_EXPIRATION_MS</w:t>
+      </w:r>
+      <w:r>
+        <w:t xml:space="preserve">: thời gian đăng nhập (mặc định 30 ngày).</w:t>
+      </w:r>
+    </w:p>
+    <w:p>
+      <w:pPr>
+        <w:numPr>
+          <w:ilvl w:val="1"/>
+          <w:numId w:val="1022"/>
+        </w:numPr>
+        <w:pStyle w:val="Compact"/>
+      </w:pPr>
+      <w:r>
+        <w:rPr>
+          <w:rStyle w:val="VerbatimChar"/>
+        </w:rPr>
+        <w:t xml:space="preserve">AWS_S3_BUCKET</w:t>
+      </w:r>
+      <w:r>
+        <w:t xml:space="preserve">,</w:t>
+      </w:r>
+      <w:r>
+        <w:t xml:space="preserve"> </w:t>
+      </w:r>
+      <w:r>
+        <w:rPr>
+          <w:rStyle w:val="VerbatimChar"/>
+        </w:rPr>
+        <w:t xml:space="preserve">AWS_ACCESS_KEY</w:t>
+      </w:r>
+      <w:r>
+        <w:t xml:space="preserve">,</w:t>
+      </w:r>
+      <w:r>
+        <w:t xml:space="preserve"> </w:t>
+      </w:r>
+      <w:r>
+        <w:rPr>
+          <w:rStyle w:val="VerbatimChar"/>
+        </w:rPr>
+        <w:t xml:space="preserve">AWS_SECRET_KEY</w:t>
+      </w:r>
+      <w:r>
+        <w:t xml:space="preserve">,</w:t>
+      </w:r>
+      <w:r>
+        <w:t xml:space="preserve"> </w:t>
+      </w:r>
+      <w:r>
+        <w:rPr>
+          <w:rStyle w:val="VerbatimChar"/>
+        </w:rPr>
+        <w:t xml:space="preserve">AWS_CDN_URL</w:t>
+      </w:r>
+      <w:r>
+        <w:t xml:space="preserve">: kho ảnh (ảnh đại diện, ảnh đánh giá).</w:t>
+      </w:r>
+    </w:p>
+    <w:p>
+      <w:pPr>
+        <w:numPr>
+          <w:ilvl w:val="0"/>
           <w:numId w:val="1021"/>
         </w:numPr>
         <w:pStyle w:val="Compact"/>
       </w:pPr>
       <w:r>
-        <w:rPr>
-          <w:rStyle w:val="VerbatimChar"/>
-        </w:rPr>
-        <w:t xml:space="preserve">GOOGLE_MAPS_API_KEY</w:t>
-      </w:r>
-      <w:r>
-        <w:t xml:space="preserve">: bật nút Tìm tự động ở địa chỉ. Bật Places API (New) trên Google Cloud. Không có key thì chỉ nhập tay được.</w:t>
-      </w:r>
-    </w:p>
-    <w:p>
-      <w:pPr>
-        <w:numPr>
-          <w:ilvl w:val="1"/>
+        <w:t xml:space="preserve">Sau mỗi lần cập nhật phiên bản có thêm thuộc tính tìm kiếm: bấm</w:t>
+      </w:r>
+      <w:r>
+        <w:t xml:space="preserve"> </w:t>
+      </w:r>
+      <w:r>
+        <w:rPr>
+          <w:bCs/>
+          <w:b/>
+        </w:rPr>
+        <w:t xml:space="preserve">Cập nhật chỉ mục ngay</w:t>
+      </w:r>
+      <w:r>
+        <w:t xml:space="preserve"> </w:t>
+      </w:r>
+      <w:r>
+        <w:t xml:space="preserve">(mục 8) một lần.</w:t>
+      </w:r>
+    </w:p>
+    <w:p>
+      <w:pPr>
+        <w:numPr>
+          <w:ilvl w:val="0"/>
           <w:numId w:val="1021"/>
-        </w:numPr>
-        <w:pStyle w:val="Compact"/>
-      </w:pPr>
-      <w:r>
-        <w:rPr>
-          <w:rStyle w:val="VerbatimChar"/>
-        </w:rPr>
-        <w:t xml:space="preserve">SEPAY_API_KEY</w:t>
-      </w:r>
-      <w:r>
-        <w:t xml:space="preserve">: webhook nhận tiền chuyển khoản.</w:t>
-      </w:r>
-    </w:p>
-    <w:p>
-      <w:pPr>
-        <w:numPr>
-          <w:ilvl w:val="1"/>
-          <w:numId w:val="1021"/>
-        </w:numPr>
-        <w:pStyle w:val="Compact"/>
-      </w:pPr>
-      <w:r>
-        <w:rPr>
-          <w:rStyle w:val="VerbatimChar"/>
-        </w:rPr>
-        <w:t xml:space="preserve">VAPID_PUBLIC_KEY</w:t>
-      </w:r>
-      <w:r>
-        <w:t xml:space="preserve">,</w:t>
-      </w:r>
-      <w:r>
-        <w:t xml:space="preserve"> </w:t>
-      </w:r>
-      <w:r>
-        <w:rPr>
-          <w:rStyle w:val="VerbatimChar"/>
-        </w:rPr>
-        <w:t xml:space="preserve">VAPID_PRIVATE_KEY</w:t>
-      </w:r>
-      <w:r>
-        <w:t xml:space="preserve">: thông báo đẩy trên điện thoại. Tạo một lần và không đổi.</w:t>
-      </w:r>
-    </w:p>
-    <w:p>
-      <w:pPr>
-        <w:numPr>
-          <w:ilvl w:val="1"/>
-          <w:numId w:val="1021"/>
-        </w:numPr>
-        <w:pStyle w:val="Compact"/>
-      </w:pPr>
-      <w:r>
-        <w:rPr>
-          <w:rStyle w:val="VerbatimChar"/>
-        </w:rPr>
-        <w:t xml:space="preserve">JWT_EXPIRATION_MS</w:t>
-      </w:r>
-      <w:r>
-        <w:t xml:space="preserve">: thời gian đăng nhập (mặc định 30 ngày).</w:t>
-      </w:r>
-    </w:p>
-    <w:p>
-      <w:pPr>
-        <w:numPr>
-          <w:ilvl w:val="1"/>
-          <w:numId w:val="1021"/>
-        </w:numPr>
-        <w:pStyle w:val="Compact"/>
-      </w:pPr>
-      <w:r>
-        <w:rPr>
-          <w:rStyle w:val="VerbatimChar"/>
-        </w:rPr>
-        <w:t xml:space="preserve">AWS_S3_BUCKET</w:t>
-      </w:r>
-      <w:r>
-        <w:t xml:space="preserve">,</w:t>
-      </w:r>
-      <w:r>
-        <w:t xml:space="preserve"> </w:t>
-      </w:r>
-      <w:r>
-        <w:rPr>
-          <w:rStyle w:val="VerbatimChar"/>
-        </w:rPr>
-        <w:t xml:space="preserve">AWS_ACCESS_KEY</w:t>
-      </w:r>
-      <w:r>
-        <w:t xml:space="preserve">,</w:t>
-      </w:r>
-      <w:r>
-        <w:t xml:space="preserve"> </w:t>
-      </w:r>
-      <w:r>
-        <w:rPr>
-          <w:rStyle w:val="VerbatimChar"/>
-        </w:rPr>
-        <w:t xml:space="preserve">AWS_SECRET_KEY</w:t>
-      </w:r>
-      <w:r>
-        <w:t xml:space="preserve">,</w:t>
-      </w:r>
-      <w:r>
-        <w:t xml:space="preserve"> </w:t>
-      </w:r>
-      <w:r>
-        <w:rPr>
-          <w:rStyle w:val="VerbatimChar"/>
-        </w:rPr>
-        <w:t xml:space="preserve">AWS_CDN_URL</w:t>
-      </w:r>
-      <w:r>
-        <w:t xml:space="preserve">: kho ảnh (ảnh đại diện, ảnh đánh giá).</w:t>
-      </w:r>
-    </w:p>
-    <w:p>
-      <w:pPr>
-        <w:numPr>
-          <w:ilvl w:val="0"/>
-          <w:numId w:val="1020"/>
-        </w:numPr>
-        <w:pStyle w:val="Compact"/>
-      </w:pPr>
-      <w:r>
-        <w:t xml:space="preserve">Sau mỗi lần cập nhật phiên bản có thêm thuộc tính tìm kiếm: bấm</w:t>
-      </w:r>
-      <w:r>
-        <w:t xml:space="preserve"> </w:t>
-      </w:r>
-      <w:r>
-        <w:rPr>
-          <w:bCs/>
-          <w:b/>
-        </w:rPr>
-        <w:t xml:space="preserve">Cập nhật chỉ mục ngay</w:t>
-      </w:r>
-      <w:r>
-        <w:t xml:space="preserve"> </w:t>
-      </w:r>
-      <w:r>
-        <w:t xml:space="preserve">(mục 8) một lần.</w:t>
-      </w:r>
-    </w:p>
-    <w:p>
-      <w:pPr>
-        <w:numPr>
-          <w:ilvl w:val="0"/>
-          <w:numId w:val="1020"/>
         </w:numPr>
         <w:pStyle w:val="Compact"/>
       </w:pPr>
@@ -4833,7 +5152,7 @@
       <w:pPr>
         <w:numPr>
           <w:ilvl w:val="0"/>
-          <w:numId w:val="1022"/>
+          <w:numId w:val="1023"/>
         </w:numPr>
         <w:pStyle w:val="Compact"/>
       </w:pPr>
@@ -4845,7 +5164,7 @@
       <w:pPr>
         <w:numPr>
           <w:ilvl w:val="0"/>
-          <w:numId w:val="1022"/>
+          <w:numId w:val="1023"/>
         </w:numPr>
         <w:pStyle w:val="Compact"/>
       </w:pPr>
@@ -4857,7 +5176,7 @@
       <w:pPr>
         <w:numPr>
           <w:ilvl w:val="0"/>
-          <w:numId w:val="1022"/>
+          <w:numId w:val="1023"/>
         </w:numPr>
         <w:pStyle w:val="Compact"/>
       </w:pPr>
@@ -4869,7 +5188,7 @@
       <w:pPr>
         <w:numPr>
           <w:ilvl w:val="0"/>
-          <w:numId w:val="1022"/>
+          <w:numId w:val="1023"/>
         </w:numPr>
         <w:pStyle w:val="Compact"/>
       </w:pPr>
@@ -4881,7 +5200,7 @@
       <w:pPr>
         <w:numPr>
           <w:ilvl w:val="0"/>
-          <w:numId w:val="1022"/>
+          <w:numId w:val="1023"/>
         </w:numPr>
         <w:pStyle w:val="Compact"/>
       </w:pPr>
@@ -5341,6 +5660,9 @@
     <w:abstractNumId w:val="991"/>
   </w:num>
   <w:num w:numId="1022">
+    <w:abstractNumId w:val="991"/>
+  </w:num>
+  <w:num w:numId="1023">
     <w:abstractNumId w:val="99411"/>
     <w:lvlOverride w:ilvl="0">
       <w:startOverride w:val="1"/>

</xml_diff>

<commit_message>
approve or decline activity registrations with a message to the family, fix the character counter over the hide-review buttons
Co-Authored-By: Claude Sonnet 5.5 <noreply@anthropic.com>
Claude-Session: https://claude.ai/code/session_01GT1iSHHmvFshTbyK6CNNWv
</commit_message>
<xml_diff>
--- a/docs/huong-dan-admin.docx
+++ b/docs/huong-dan-admin.docx
@@ -3933,6 +3933,73 @@
       </w:r>
       <w:r>
         <w:t xml:space="preserve">(không viết "điểm"); giá trị quy đổi ghi "~120.000đ".</w:t>
+      </w:r>
+    </w:p>
+    <w:p>
+      <w:pPr>
+        <w:numPr>
+          <w:ilvl w:val="0"/>
+          <w:numId w:val="1020"/>
+        </w:numPr>
+        <w:pStyle w:val="Compact"/>
+      </w:pPr>
+      <w:r>
+        <w:rPr>
+          <w:bCs/>
+          <w:b/>
+        </w:rPr>
+        <w:t xml:space="preserve">Hoạt động (đăng ký học thử, test đầu vào, tham quan):</w:t>
+      </w:r>
+      <w:r>
+        <w:t xml:space="preserve"> </w:t>
+      </w:r>
+      <w:r>
+        <w:t xml:space="preserve">menu Quản lý thành viên &gt; Hoạt động. Mỗi dòng chờ duyệt có hai nút</w:t>
+      </w:r>
+      <w:r>
+        <w:t xml:space="preserve"> </w:t>
+      </w:r>
+      <w:r>
+        <w:rPr>
+          <w:bCs/>
+          <w:b/>
+        </w:rPr>
+        <w:t xml:space="preserve">Duyệt</w:t>
+      </w:r>
+      <w:r>
+        <w:t xml:space="preserve"> </w:t>
+      </w:r>
+      <w:r>
+        <w:t xml:space="preserve">và</w:t>
+      </w:r>
+      <w:r>
+        <w:t xml:space="preserve"> </w:t>
+      </w:r>
+      <w:r>
+        <w:rPr>
+          <w:bCs/>
+          <w:b/>
+        </w:rPr>
+        <w:t xml:space="preserve">Từ chối</w:t>
+      </w:r>
+      <w:r>
+        <w:t xml:space="preserve">; bấm nút nào cũng mở hộp để nhập nội dung gửi khách qua thông báo. Duyệt: ghi thêm giờ, địa điểm, đồ cần mang (không bắt buộc). Từ chối:</w:t>
+      </w:r>
+      <w:r>
+        <w:t xml:space="preserve"> </w:t>
+      </w:r>
+      <w:r>
+        <w:rPr>
+          <w:bCs/>
+          <w:b/>
+        </w:rPr>
+        <w:t xml:space="preserve">bắt buộc</w:t>
+      </w:r>
+      <w:r>
+        <w:t xml:space="preserve"> </w:t>
+      </w:r>
+      <w:r>
+        <w:t xml:space="preserve">nhập lý do. Nếu người đăng ký là bé thì thông báo gửi cho phụ huynh. Nội dung đã gửi hiện lại dưới trạng thái của dòng đó.</w:t>
       </w:r>
     </w:p>
     <w:p>

</xml_diff>

<commit_message>
show courses only when they are on and their partner is active and signed
Co-Authored-By: Claude Sonnet 5.5 <noreply@anthropic.com>
Claude-Session: https://claude.ai/code/session_01GT1iSHHmvFshTbyK6CNNWv
</commit_message>
<xml_diff>
--- a/docs/huong-dan-admin.docx
+++ b/docs/huong-dan-admin.docx
@@ -28,7 +28,7 @@
         </w:p>
       </w:sdtContent>
     </w:sdt>
-    <w:bookmarkStart w:id="47" w:name="X007917dc19a542ae70c55e775b6240c49fe84f6"/>
+    <w:bookmarkStart w:id="48" w:name="X007917dc19a542ae70c55e775b6240c49fe84f6"/>
     <w:p>
       <w:pPr>
         <w:pStyle w:val="Heading1"/>
@@ -1168,7 +1168,7 @@
     </w:p>
     <w:bookmarkEnd w:id="24"/>
     <w:bookmarkEnd w:id="25"/>
-    <w:bookmarkStart w:id="31" w:name="X00944b4b4e7edfe7a43666e0284a6ee04917b4e"/>
+    <w:bookmarkStart w:id="32" w:name="X00944b4b4e7edfe7a43666e0284a6ee04917b4e"/>
     <w:p>
       <w:pPr>
         <w:pStyle w:val="Heading2"/>
@@ -1177,12 +1177,158 @@
         <w:t xml:space="preserve">3. Khóa học</w:t>
       </w:r>
     </w:p>
-    <w:bookmarkStart w:id="26" w:name="Xdfa0b4de9e06995fa91453e85773ea6611effef"/>
+    <w:bookmarkStart w:id="26" w:name="X24afb95ee8ca42fea5a00b1ac2734b932c8e501"/>
     <w:p>
       <w:pPr>
         <w:pStyle w:val="Heading3"/>
       </w:pPr>
       <w:r>
+        <w:t xml:space="preserve">3.0 Khóa nào được hiện cho khách</w:t>
+      </w:r>
+    </w:p>
+    <w:p>
+      <w:pPr>
+        <w:pStyle w:val="FirstParagraph"/>
+      </w:pPr>
+      <w:r>
+        <w:t xml:space="preserve">Một khóa chỉ hiện cho khách (tìm kiếm, trang chủ, danh mục, bộ sưu tập, trang đối tác, khóa liên quan, "Thử điều mới") khi</w:t>
+      </w:r>
+      <w:r>
+        <w:t xml:space="preserve"> </w:t>
+      </w:r>
+      <w:r>
+        <w:rPr>
+          <w:bCs/>
+          <w:b/>
+        </w:rPr>
+        <w:t xml:space="preserve">đủ cả bốn điều kiện</w:t>
+      </w:r>
+      <w:r>
+        <w:t xml:space="preserve">:</w:t>
+      </w:r>
+    </w:p>
+    <w:p>
+      <w:pPr>
+        <w:numPr>
+          <w:ilvl w:val="0"/>
+          <w:numId w:val="1005"/>
+        </w:numPr>
+        <w:pStyle w:val="Compact"/>
+      </w:pPr>
+      <w:r>
+        <w:t xml:space="preserve">Khóa đang</w:t>
+      </w:r>
+      <w:r>
+        <w:t xml:space="preserve"> </w:t>
+      </w:r>
+      <w:r>
+        <w:rPr>
+          <w:bCs/>
+          <w:b/>
+        </w:rPr>
+        <w:t xml:space="preserve">Hiển thị</w:t>
+      </w:r>
+      <w:r>
+        <w:t xml:space="preserve"> </w:t>
+      </w:r>
+      <w:r>
+        <w:t xml:space="preserve">(cột Platform) và</w:t>
+      </w:r>
+      <w:r>
+        <w:t xml:space="preserve"> </w:t>
+      </w:r>
+      <w:r>
+        <w:rPr>
+          <w:bCs/>
+          <w:b/>
+        </w:rPr>
+        <w:t xml:space="preserve">Đã duyệt</w:t>
+      </w:r>
+      <w:r>
+        <w:t xml:space="preserve"> </w:t>
+      </w:r>
+      <w:r>
+        <w:t xml:space="preserve">(cột Đối tác duyệt).</w:t>
+      </w:r>
+    </w:p>
+    <w:p>
+      <w:pPr>
+        <w:numPr>
+          <w:ilvl w:val="0"/>
+          <w:numId w:val="1005"/>
+        </w:numPr>
+        <w:pStyle w:val="Compact"/>
+      </w:pPr>
+      <w:r>
+        <w:t xml:space="preserve">Đối tác sở hữu khóa có trạng thái</w:t>
+      </w:r>
+      <w:r>
+        <w:t xml:space="preserve"> </w:t>
+      </w:r>
+      <w:r>
+        <w:rPr>
+          <w:bCs/>
+          <w:b/>
+        </w:rPr>
+        <w:t xml:space="preserve">hoạt động</w:t>
+      </w:r>
+      <w:r>
+        <w:t xml:space="preserve">.</w:t>
+      </w:r>
+    </w:p>
+    <w:p>
+      <w:pPr>
+        <w:numPr>
+          <w:ilvl w:val="0"/>
+          <w:numId w:val="1005"/>
+        </w:numPr>
+        <w:pStyle w:val="Compact"/>
+      </w:pPr>
+      <w:r>
+        <w:t xml:space="preserve">Đối tác đã</w:t>
+      </w:r>
+      <w:r>
+        <w:t xml:space="preserve"> </w:t>
+      </w:r>
+      <w:r>
+        <w:rPr>
+          <w:bCs/>
+          <w:b/>
+        </w:rPr>
+        <w:t xml:space="preserve">Ký HĐ</w:t>
+      </w:r>
+      <w:r>
+        <w:t xml:space="preserve"> </w:t>
+      </w:r>
+      <w:r>
+        <w:t xml:space="preserve">(công tắc Ký HĐ ở trang Thành viên, tương ứng hợp đồng ở trạng thái đã duyệt).</w:t>
+      </w:r>
+    </w:p>
+    <w:p>
+      <w:pPr>
+        <w:pStyle w:val="FirstParagraph"/>
+      </w:pPr>
+      <w:r>
+        <w:t xml:space="preserve">Thiếu một điều kiện thì khóa biến khỏi mọi danh sách; mở link trực tiếp cũng báo "Trang không tồn tại". Ngoại lệ: admin, chính đối tác đó và người đã mua khóa vẫn mở được trang khóa. Bật hoặc tắt công tắc Ký HĐ, hoặc đổi trạng thái đối tác, thì các khóa của đối tác được cập nhật lại trong tìm kiếm trong vài phút (không cần bấm "Cập nhật chỉ mục ngay").</w:t>
+      </w:r>
+      <w:r>
+        <w:t xml:space="preserve"> </w:t>
+      </w:r>
+      <w:r>
+        <w:rPr>
+          <w:bCs/>
+          <w:b/>
+        </w:rPr>
+        <w:t xml:space="preserve">Trước khi triển khai bản này, kiểm tra công tắc Ký HĐ của các đối tác chính, nếu không toàn bộ khóa của họ sẽ biến mất.</w:t>
+      </w:r>
+    </w:p>
+    <w:bookmarkEnd w:id="26"/>
+    <w:bookmarkStart w:id="27" w:name="Xdfa0b4de9e06995fa91453e85773ea6611effef"/>
+    <w:p>
+      <w:pPr>
+        <w:pStyle w:val="Heading3"/>
+      </w:pPr>
+      <w:r>
         <w:t xml:space="preserve">3.1 Hình thức học và địa chỉ bắt buộc</w:t>
       </w:r>
     </w:p>
@@ -1222,7 +1368,7 @@
       <w:pPr>
         <w:numPr>
           <w:ilvl w:val="0"/>
-          <w:numId w:val="1005"/>
+          <w:numId w:val="1006"/>
         </w:numPr>
         <w:pStyle w:val="Compact"/>
       </w:pPr>
@@ -1247,7 +1393,7 @@
       <w:pPr>
         <w:numPr>
           <w:ilvl w:val="0"/>
-          <w:numId w:val="1005"/>
+          <w:numId w:val="1006"/>
         </w:numPr>
         <w:pStyle w:val="Compact"/>
       </w:pPr>
@@ -1272,7 +1418,7 @@
       <w:pPr>
         <w:numPr>
           <w:ilvl w:val="0"/>
-          <w:numId w:val="1005"/>
+          <w:numId w:val="1006"/>
         </w:numPr>
         <w:pStyle w:val="Compact"/>
       </w:pPr>
@@ -1284,7 +1430,7 @@
       <w:pPr>
         <w:numPr>
           <w:ilvl w:val="0"/>
-          <w:numId w:val="1005"/>
+          <w:numId w:val="1006"/>
         </w:numPr>
         <w:pStyle w:val="Compact"/>
       </w:pPr>
@@ -1292,8 +1438,8 @@
         <w:t xml:space="preserve">Thu hộ học phí vẫn cần địa chỉ học.</w:t>
       </w:r>
     </w:p>
-    <w:bookmarkEnd w:id="26"/>
-    <w:bookmarkStart w:id="27" w:name="X0b8ce40ad8cc810d54fffe2698fa0254b212b05"/>
+    <w:bookmarkEnd w:id="27"/>
+    <w:bookmarkStart w:id="28" w:name="X0b8ce40ad8cc810d54fffe2698fa0254b212b05"/>
     <w:p>
       <w:pPr>
         <w:pStyle w:val="Heading3"/>
@@ -1306,7 +1452,7 @@
       <w:pPr>
         <w:numPr>
           <w:ilvl w:val="0"/>
-          <w:numId w:val="1006"/>
+          <w:numId w:val="1007"/>
         </w:numPr>
         <w:pStyle w:val="Compact"/>
       </w:pPr>
@@ -1347,7 +1493,7 @@
       <w:pPr>
         <w:numPr>
           <w:ilvl w:val="0"/>
-          <w:numId w:val="1006"/>
+          <w:numId w:val="1007"/>
         </w:numPr>
         <w:pStyle w:val="Compact"/>
       </w:pPr>
@@ -1366,7 +1512,7 @@
       <w:pPr>
         <w:numPr>
           <w:ilvl w:val="0"/>
-          <w:numId w:val="1006"/>
+          <w:numId w:val="1007"/>
         </w:numPr>
         <w:pStyle w:val="Compact"/>
       </w:pPr>
@@ -1384,8 +1530,8 @@
         <w:t xml:space="preserve">= học phí chia cho số buổi suy ra từ chu kỳ. Chu kỳ tính bằng tuần hoặc tháng cần ca học có ghi các thứ trong tuần mới tính được.</w:t>
       </w:r>
     </w:p>
-    <w:bookmarkEnd w:id="27"/>
-    <w:bookmarkStart w:id="28" w:name="X47a5798cd637e99b1bb65b425b4813a8b1562d5"/>
+    <w:bookmarkEnd w:id="28"/>
+    <w:bookmarkStart w:id="29" w:name="X47a5798cd637e99b1bb65b425b4813a8b1562d5"/>
     <w:p>
       <w:pPr>
         <w:pStyle w:val="Heading3"/>
@@ -1398,7 +1544,7 @@
       <w:pPr>
         <w:numPr>
           <w:ilvl w:val="0"/>
-          <w:numId w:val="1007"/>
+          <w:numId w:val="1008"/>
         </w:numPr>
         <w:pStyle w:val="Compact"/>
       </w:pPr>
@@ -1426,8 +1572,8 @@
         <w:t xml:space="preserve">: giá niêm yết. Gốc lớn hơn bán thì khóa được gắn "Giảm giá" và lọt bộ lọc "Đang giảm giá".</w:t>
       </w:r>
     </w:p>
-    <w:bookmarkEnd w:id="28"/>
-    <w:bookmarkStart w:id="29" w:name="X72650332f76cbb9777dab91128d64bb82b4a207"/>
+    <w:bookmarkEnd w:id="29"/>
+    <w:bookmarkStart w:id="30" w:name="X72650332f76cbb9777dab91128d64bb82b4a207"/>
     <w:p>
       <w:pPr>
         <w:pStyle w:val="Heading3"/>
@@ -1450,8 +1596,8 @@
         <w:t xml:space="preserve">Bé chỉ có năm sinh được tính theo hai tuổi có thể; khóa hiện nếu một trong hai tuổi nằm trong giới hạn.</w:t>
       </w:r>
     </w:p>
-    <w:bookmarkEnd w:id="29"/>
-    <w:bookmarkStart w:id="30" w:name="X8a07753505a4569426544c475134b7a17f2d01a"/>
+    <w:bookmarkEnd w:id="30"/>
+    <w:bookmarkStart w:id="31" w:name="X8a07753505a4569426544c475134b7a17f2d01a"/>
     <w:p>
       <w:pPr>
         <w:pStyle w:val="Heading3"/>
@@ -1513,9 +1659,9 @@
         </w:pict>
       </w:r>
     </w:p>
-    <w:bookmarkEnd w:id="30"/>
     <w:bookmarkEnd w:id="31"/>
-    <w:bookmarkStart w:id="32" w:name="X629ca0686fd40acf7949198bba57762c79c3ea4"/>
+    <w:bookmarkEnd w:id="32"/>
+    <w:bookmarkStart w:id="33" w:name="X629ca0686fd40acf7949198bba57762c79c3ea4"/>
     <w:p>
       <w:pPr>
         <w:pStyle w:val="Heading2"/>
@@ -1565,7 +1711,7 @@
       <w:pPr>
         <w:numPr>
           <w:ilvl w:val="0"/>
-          <w:numId w:val="1008"/>
+          <w:numId w:val="1009"/>
         </w:numPr>
         <w:pStyle w:val="Compact"/>
       </w:pPr>
@@ -1584,7 +1730,7 @@
       <w:pPr>
         <w:numPr>
           <w:ilvl w:val="0"/>
-          <w:numId w:val="1008"/>
+          <w:numId w:val="1009"/>
         </w:numPr>
         <w:pStyle w:val="Compact"/>
       </w:pPr>
@@ -1596,7 +1742,7 @@
       <w:pPr>
         <w:numPr>
           <w:ilvl w:val="0"/>
-          <w:numId w:val="1008"/>
+          <w:numId w:val="1009"/>
         </w:numPr>
         <w:pStyle w:val="Compact"/>
       </w:pPr>
@@ -1615,7 +1761,7 @@
       <w:pPr>
         <w:numPr>
           <w:ilvl w:val="0"/>
-          <w:numId w:val="1008"/>
+          <w:numId w:val="1009"/>
         </w:numPr>
         <w:pStyle w:val="Compact"/>
       </w:pPr>
@@ -1637,7 +1783,7 @@
       <w:pPr>
         <w:numPr>
           <w:ilvl w:val="0"/>
-          <w:numId w:val="1008"/>
+          <w:numId w:val="1009"/>
         </w:numPr>
         <w:pStyle w:val="Compact"/>
       </w:pPr>
@@ -1649,7 +1795,7 @@
       <w:pPr>
         <w:numPr>
           <w:ilvl w:val="0"/>
-          <w:numId w:val="1008"/>
+          <w:numId w:val="1009"/>
         </w:numPr>
         <w:pStyle w:val="Compact"/>
       </w:pPr>
@@ -1664,8 +1810,8 @@
         </w:pict>
       </w:r>
     </w:p>
-    <w:bookmarkEnd w:id="32"/>
-    <w:bookmarkStart w:id="36" w:name="Xfff21d791d25c6c1218762372e4c768b3f201f4"/>
+    <w:bookmarkEnd w:id="33"/>
+    <w:bookmarkStart w:id="37" w:name="Xfff21d791d25c6c1218762372e4c768b3f201f4"/>
     <w:p>
       <w:pPr>
         <w:pStyle w:val="Heading2"/>
@@ -1674,7 +1820,7 @@
         <w:t xml:space="preserve">5. Tìm kiếm của khách</w:t>
       </w:r>
     </w:p>
-    <w:bookmarkStart w:id="33" w:name="X97b71884f2cc43ae5acb3eb9493ab0839cf741b"/>
+    <w:bookmarkStart w:id="34" w:name="X97b71884f2cc43ae5acb3eb9493ab0839cf741b"/>
     <w:p>
       <w:pPr>
         <w:pStyle w:val="Heading3"/>
@@ -1687,7 +1833,7 @@
       <w:pPr>
         <w:numPr>
           <w:ilvl w:val="0"/>
-          <w:numId w:val="1009"/>
+          <w:numId w:val="1010"/>
         </w:numPr>
         <w:pStyle w:val="Compact"/>
       </w:pPr>
@@ -1718,7 +1864,7 @@
       <w:pPr>
         <w:numPr>
           <w:ilvl w:val="0"/>
-          <w:numId w:val="1009"/>
+          <w:numId w:val="1010"/>
         </w:numPr>
         <w:pStyle w:val="Compact"/>
       </w:pPr>
@@ -1737,7 +1883,7 @@
       <w:pPr>
         <w:numPr>
           <w:ilvl w:val="0"/>
-          <w:numId w:val="1009"/>
+          <w:numId w:val="1010"/>
         </w:numPr>
         <w:pStyle w:val="Compact"/>
       </w:pPr>
@@ -1749,7 +1895,7 @@
       <w:pPr>
         <w:numPr>
           <w:ilvl w:val="0"/>
-          <w:numId w:val="1009"/>
+          <w:numId w:val="1010"/>
         </w:numPr>
         <w:pStyle w:val="Compact"/>
       </w:pPr>
@@ -1761,7 +1907,7 @@
       <w:pPr>
         <w:numPr>
           <w:ilvl w:val="0"/>
-          <w:numId w:val="1009"/>
+          <w:numId w:val="1010"/>
         </w:numPr>
         <w:pStyle w:val="Compact"/>
       </w:pPr>
@@ -1769,8 +1915,8 @@
         <w:t xml:space="preserve">Mọi lựa chọn nằm trên địa chỉ trang web, nên khách và team gửi link tìm kiếm cho nhau được.</w:t>
       </w:r>
     </w:p>
-    <w:bookmarkEnd w:id="33"/>
-    <w:bookmarkStart w:id="34" w:name="Xd1e119d2f9951d18d85b83bb910c62f15f9763b"/>
+    <w:bookmarkEnd w:id="34"/>
+    <w:bookmarkStart w:id="35" w:name="Xd1e119d2f9951d18d85b83bb910c62f15f9763b"/>
     <w:p>
       <w:pPr>
         <w:pStyle w:val="Heading3"/>
@@ -1783,7 +1929,7 @@
       <w:pPr>
         <w:numPr>
           <w:ilvl w:val="0"/>
-          <w:numId w:val="1010"/>
+          <w:numId w:val="1011"/>
         </w:numPr>
         <w:pStyle w:val="Compact"/>
       </w:pPr>
@@ -1795,7 +1941,7 @@
       <w:pPr>
         <w:numPr>
           <w:ilvl w:val="0"/>
-          <w:numId w:val="1010"/>
+          <w:numId w:val="1011"/>
         </w:numPr>
         <w:pStyle w:val="Compact"/>
       </w:pPr>
@@ -1807,7 +1953,7 @@
       <w:pPr>
         <w:numPr>
           <w:ilvl w:val="0"/>
-          <w:numId w:val="1010"/>
+          <w:numId w:val="1011"/>
         </w:numPr>
         <w:pStyle w:val="Compact"/>
       </w:pPr>
@@ -1861,8 +2007,8 @@
         <w:t xml:space="preserve">Khách chỉ gửi tọa độ làm tròn khoảng 100 m, không gửi vị trí chính xác.</w:t>
       </w:r>
     </w:p>
-    <w:bookmarkEnd w:id="34"/>
-    <w:bookmarkStart w:id="35" w:name="X961ef8fdef3db71e20ef5d7aa1bea9b4688ca3b"/>
+    <w:bookmarkEnd w:id="35"/>
+    <w:bookmarkStart w:id="36" w:name="X961ef8fdef3db71e20ef5d7aa1bea9b4688ca3b"/>
     <w:p>
       <w:pPr>
         <w:pStyle w:val="Heading3"/>
@@ -1908,9 +2054,9 @@
         </w:pict>
       </w:r>
     </w:p>
-    <w:bookmarkEnd w:id="35"/>
     <w:bookmarkEnd w:id="36"/>
-    <w:bookmarkStart w:id="37" w:name="X6c00310ef9ed70498f561dae3de1a155501caf1"/>
+    <w:bookmarkEnd w:id="37"/>
+    <w:bookmarkStart w:id="38" w:name="X6c00310ef9ed70498f561dae3de1a155501caf1"/>
     <w:p>
       <w:pPr>
         <w:pStyle w:val="Heading2"/>
@@ -1983,7 +2129,7 @@
       <w:pPr>
         <w:numPr>
           <w:ilvl w:val="0"/>
-          <w:numId w:val="1011"/>
+          <w:numId w:val="1012"/>
         </w:numPr>
         <w:pStyle w:val="Compact"/>
       </w:pPr>
@@ -2002,7 +2148,7 @@
       <w:pPr>
         <w:numPr>
           <w:ilvl w:val="0"/>
-          <w:numId w:val="1011"/>
+          <w:numId w:val="1012"/>
         </w:numPr>
         <w:pStyle w:val="Compact"/>
       </w:pPr>
@@ -2037,7 +2183,7 @@
       <w:pPr>
         <w:numPr>
           <w:ilvl w:val="0"/>
-          <w:numId w:val="1011"/>
+          <w:numId w:val="1012"/>
         </w:numPr>
         <w:pStyle w:val="Compact"/>
       </w:pPr>
@@ -2056,7 +2202,7 @@
       <w:pPr>
         <w:numPr>
           <w:ilvl w:val="0"/>
-          <w:numId w:val="1011"/>
+          <w:numId w:val="1012"/>
         </w:numPr>
         <w:pStyle w:val="Compact"/>
       </w:pPr>
@@ -2091,7 +2237,7 @@
       <w:pPr>
         <w:numPr>
           <w:ilvl w:val="0"/>
-          <w:numId w:val="1011"/>
+          <w:numId w:val="1012"/>
         </w:numPr>
         <w:pStyle w:val="Compact"/>
       </w:pPr>
@@ -2119,7 +2265,7 @@
       <w:pPr>
         <w:numPr>
           <w:ilvl w:val="0"/>
-          <w:numId w:val="1011"/>
+          <w:numId w:val="1012"/>
         </w:numPr>
         <w:pStyle w:val="Compact"/>
       </w:pPr>
@@ -2134,8 +2280,8 @@
         </w:pict>
       </w:r>
     </w:p>
-    <w:bookmarkEnd w:id="37"/>
-    <w:bookmarkStart w:id="38" w:name="X18b0f2b33e20f23d839061abdedea9e7554ccae"/>
+    <w:bookmarkEnd w:id="38"/>
+    <w:bookmarkStart w:id="39" w:name="X18b0f2b33e20f23d839061abdedea9e7554ccae"/>
     <w:p>
       <w:pPr>
         <w:pStyle w:val="Heading2"/>
@@ -2181,7 +2327,7 @@
       <w:pPr>
         <w:numPr>
           <w:ilvl w:val="0"/>
-          <w:numId w:val="1012"/>
+          <w:numId w:val="1013"/>
         </w:numPr>
         <w:pStyle w:val="Compact"/>
       </w:pPr>
@@ -2206,7 +2352,7 @@
       <w:pPr>
         <w:numPr>
           <w:ilvl w:val="0"/>
-          <w:numId w:val="1012"/>
+          <w:numId w:val="1013"/>
         </w:numPr>
         <w:pStyle w:val="Compact"/>
       </w:pPr>
@@ -2225,7 +2371,7 @@
       <w:pPr>
         <w:numPr>
           <w:ilvl w:val="0"/>
-          <w:numId w:val="1012"/>
+          <w:numId w:val="1013"/>
         </w:numPr>
         <w:pStyle w:val="Compact"/>
       </w:pPr>
@@ -2244,7 +2390,7 @@
       <w:pPr>
         <w:numPr>
           <w:ilvl w:val="0"/>
-          <w:numId w:val="1012"/>
+          <w:numId w:val="1013"/>
         </w:numPr>
         <w:pStyle w:val="Compact"/>
       </w:pPr>
@@ -2256,74 +2402,74 @@
       <w:pPr>
         <w:numPr>
           <w:ilvl w:val="1"/>
+          <w:numId w:val="1014"/>
+        </w:numPr>
+        <w:pStyle w:val="Compact"/>
+      </w:pPr>
+      <w:r>
+        <w:rPr>
+          <w:bCs/>
+          <w:b/>
+        </w:rPr>
+        <w:t xml:space="preserve">Tìm</w:t>
+      </w:r>
+      <w:r>
+        <w:t xml:space="preserve">: gõ từ khóa rồi bấm Tìm.</w:t>
+      </w:r>
+    </w:p>
+    <w:p>
+      <w:pPr>
+        <w:numPr>
+          <w:ilvl w:val="1"/>
+          <w:numId w:val="1014"/>
+        </w:numPr>
+        <w:pStyle w:val="Compact"/>
+      </w:pPr>
+      <w:r>
+        <w:rPr>
+          <w:bCs/>
+          <w:b/>
+        </w:rPr>
+        <w:t xml:space="preserve">Gợi ý theo bộ lọc</w:t>
+      </w:r>
+      <w:r>
+        <w:t xml:space="preserve">: mở khối bộ lọc (độ tuổi, khu vực, hình thức, loại đối tác, kỹ năng, khung giờ, học phí tối đa, có học thử, đang giảm giá) rồi bấm Gợi ý. Có thể kết hợp từ khóa và bộ lọc.</w:t>
+      </w:r>
+    </w:p>
+    <w:p>
+      <w:pPr>
+        <w:numPr>
+          <w:ilvl w:val="1"/>
+          <w:numId w:val="1014"/>
+        </w:numPr>
+        <w:pStyle w:val="Compact"/>
+      </w:pPr>
+      <w:r>
+        <w:t xml:space="preserve">Tick các khóa cần thêm, bấm</w:t>
+      </w:r>
+      <w:r>
+        <w:t xml:space="preserve"> </w:t>
+      </w:r>
+      <w:r>
+        <w:rPr>
+          <w:bCs/>
+          <w:b/>
+        </w:rPr>
+        <w:t xml:space="preserve">Thêm N khóa đã chọn</w:t>
+      </w:r>
+      <w:r>
+        <w:t xml:space="preserve">. Khóa đã có trong bộ hiện nhãn "Đã thêm" và không tick được. Có nút chọn tất cả trang đang xem.</w:t>
+      </w:r>
+    </w:p>
+    <w:p>
+      <w:pPr>
+        <w:numPr>
+          <w:ilvl w:val="0"/>
           <w:numId w:val="1013"/>
         </w:numPr>
         <w:pStyle w:val="Compact"/>
       </w:pPr>
       <w:r>
-        <w:rPr>
-          <w:bCs/>
-          <w:b/>
-        </w:rPr>
-        <w:t xml:space="preserve">Tìm</w:t>
-      </w:r>
-      <w:r>
-        <w:t xml:space="preserve">: gõ từ khóa rồi bấm Tìm.</w:t>
-      </w:r>
-    </w:p>
-    <w:p>
-      <w:pPr>
-        <w:numPr>
-          <w:ilvl w:val="1"/>
-          <w:numId w:val="1013"/>
-        </w:numPr>
-        <w:pStyle w:val="Compact"/>
-      </w:pPr>
-      <w:r>
-        <w:rPr>
-          <w:bCs/>
-          <w:b/>
-        </w:rPr>
-        <w:t xml:space="preserve">Gợi ý theo bộ lọc</w:t>
-      </w:r>
-      <w:r>
-        <w:t xml:space="preserve">: mở khối bộ lọc (độ tuổi, khu vực, hình thức, loại đối tác, kỹ năng, khung giờ, học phí tối đa, có học thử, đang giảm giá) rồi bấm Gợi ý. Có thể kết hợp từ khóa và bộ lọc.</w:t>
-      </w:r>
-    </w:p>
-    <w:p>
-      <w:pPr>
-        <w:numPr>
-          <w:ilvl w:val="1"/>
-          <w:numId w:val="1013"/>
-        </w:numPr>
-        <w:pStyle w:val="Compact"/>
-      </w:pPr>
-      <w:r>
-        <w:t xml:space="preserve">Tick các khóa cần thêm, bấm</w:t>
-      </w:r>
-      <w:r>
-        <w:t xml:space="preserve"> </w:t>
-      </w:r>
-      <w:r>
-        <w:rPr>
-          <w:bCs/>
-          <w:b/>
-        </w:rPr>
-        <w:t xml:space="preserve">Thêm N khóa đã chọn</w:t>
-      </w:r>
-      <w:r>
-        <w:t xml:space="preserve">. Khóa đã có trong bộ hiện nhãn "Đã thêm" và không tick được. Có nút chọn tất cả trang đang xem.</w:t>
-      </w:r>
-    </w:p>
-    <w:p>
-      <w:pPr>
-        <w:numPr>
-          <w:ilvl w:val="0"/>
-          <w:numId w:val="1012"/>
-        </w:numPr>
-        <w:pStyle w:val="Compact"/>
-      </w:pPr>
-      <w:r>
         <w:t xml:space="preserve">Sắp xếp thứ tự khóa bằng mũi tên, bỏ khóa bằng nút ✕. Bấm</w:t>
       </w:r>
       <w:r>
@@ -2356,7 +2502,7 @@
       <w:pPr>
         <w:numPr>
           <w:ilvl w:val="0"/>
-          <w:numId w:val="1014"/>
+          <w:numId w:val="1015"/>
         </w:numPr>
         <w:pStyle w:val="Compact"/>
       </w:pPr>
@@ -2368,7 +2514,7 @@
       <w:pPr>
         <w:numPr>
           <w:ilvl w:val="0"/>
-          <w:numId w:val="1014"/>
+          <w:numId w:val="1015"/>
         </w:numPr>
         <w:pStyle w:val="Compact"/>
       </w:pPr>
@@ -2380,7 +2526,7 @@
       <w:pPr>
         <w:numPr>
           <w:ilvl w:val="0"/>
-          <w:numId w:val="1014"/>
+          <w:numId w:val="1015"/>
         </w:numPr>
         <w:pStyle w:val="Compact"/>
       </w:pPr>
@@ -2392,7 +2538,7 @@
       <w:pPr>
         <w:numPr>
           <w:ilvl w:val="0"/>
-          <w:numId w:val="1014"/>
+          <w:numId w:val="1015"/>
         </w:numPr>
         <w:pStyle w:val="Compact"/>
       </w:pPr>
@@ -2419,8 +2565,8 @@
         </w:pict>
       </w:r>
     </w:p>
-    <w:bookmarkEnd w:id="38"/>
-    <w:bookmarkStart w:id="39" w:name="X095fe1c10eb093681e6974134e40ee34e2ff91d"/>
+    <w:bookmarkEnd w:id="39"/>
+    <w:bookmarkStart w:id="40" w:name="X095fe1c10eb093681e6974134e40ee34e2ff91d"/>
     <w:p>
       <w:pPr>
         <w:pStyle w:val="Heading2"/>
@@ -2487,7 +2633,7 @@
       <w:pPr>
         <w:numPr>
           <w:ilvl w:val="0"/>
-          <w:numId w:val="1015"/>
+          <w:numId w:val="1016"/>
         </w:numPr>
         <w:pStyle w:val="Compact"/>
       </w:pPr>
@@ -2554,7 +2700,7 @@
       <w:pPr>
         <w:numPr>
           <w:ilvl w:val="0"/>
-          <w:numId w:val="1015"/>
+          <w:numId w:val="1016"/>
         </w:numPr>
         <w:pStyle w:val="Compact"/>
       </w:pPr>
@@ -2566,7 +2712,7 @@
       <w:pPr>
         <w:numPr>
           <w:ilvl w:val="0"/>
-          <w:numId w:val="1015"/>
+          <w:numId w:val="1016"/>
         </w:numPr>
         <w:pStyle w:val="Compact"/>
       </w:pPr>
@@ -2578,7 +2724,7 @@
       <w:pPr>
         <w:numPr>
           <w:ilvl w:val="0"/>
-          <w:numId w:val="1015"/>
+          <w:numId w:val="1016"/>
         </w:numPr>
         <w:pStyle w:val="Compact"/>
       </w:pPr>
@@ -2621,7 +2767,7 @@
       <w:pPr>
         <w:numPr>
           <w:ilvl w:val="0"/>
-          <w:numId w:val="1016"/>
+          <w:numId w:val="1017"/>
         </w:numPr>
         <w:pStyle w:val="Compact"/>
       </w:pPr>
@@ -2646,7 +2792,7 @@
       <w:pPr>
         <w:numPr>
           <w:ilvl w:val="0"/>
-          <w:numId w:val="1016"/>
+          <w:numId w:val="1017"/>
         </w:numPr>
         <w:pStyle w:val="Compact"/>
       </w:pPr>
@@ -2658,7 +2804,7 @@
       <w:pPr>
         <w:numPr>
           <w:ilvl w:val="0"/>
-          <w:numId w:val="1016"/>
+          <w:numId w:val="1017"/>
         </w:numPr>
         <w:pStyle w:val="Compact"/>
       </w:pPr>
@@ -2697,7 +2843,7 @@
       <w:pPr>
         <w:numPr>
           <w:ilvl w:val="0"/>
-          <w:numId w:val="1017"/>
+          <w:numId w:val="1018"/>
         </w:numPr>
         <w:pStyle w:val="Compact"/>
       </w:pPr>
@@ -2722,7 +2868,7 @@
       <w:pPr>
         <w:numPr>
           <w:ilvl w:val="0"/>
-          <w:numId w:val="1017"/>
+          <w:numId w:val="1018"/>
         </w:numPr>
         <w:pStyle w:val="Compact"/>
       </w:pPr>
@@ -2734,7 +2880,7 @@
       <w:pPr>
         <w:numPr>
           <w:ilvl w:val="0"/>
-          <w:numId w:val="1017"/>
+          <w:numId w:val="1018"/>
         </w:numPr>
         <w:pStyle w:val="Compact"/>
       </w:pPr>
@@ -2746,7 +2892,7 @@
       <w:pPr>
         <w:numPr>
           <w:ilvl w:val="0"/>
-          <w:numId w:val="1017"/>
+          <w:numId w:val="1018"/>
         </w:numPr>
         <w:pStyle w:val="Compact"/>
       </w:pPr>
@@ -2761,8 +2907,8 @@
         </w:pict>
       </w:r>
     </w:p>
-    <w:bookmarkEnd w:id="39"/>
-    <w:bookmarkStart w:id="40" w:name="Xe4962c352abea334483ff211ab7cd27542928cf"/>
+    <w:bookmarkEnd w:id="40"/>
+    <w:bookmarkStart w:id="41" w:name="Xe4962c352abea334483ff211ab7cd27542928cf"/>
     <w:p>
       <w:pPr>
         <w:pStyle w:val="Heading2"/>
@@ -2953,7 +3099,7 @@
       <w:pPr>
         <w:numPr>
           <w:ilvl w:val="0"/>
-          <w:numId w:val="1018"/>
+          <w:numId w:val="1019"/>
         </w:numPr>
         <w:pStyle w:val="Compact"/>
       </w:pPr>
@@ -3046,7 +3192,7 @@
       <w:pPr>
         <w:numPr>
           <w:ilvl w:val="0"/>
-          <w:numId w:val="1018"/>
+          <w:numId w:val="1019"/>
         </w:numPr>
         <w:pStyle w:val="Compact"/>
       </w:pPr>
@@ -3100,7 +3246,7 @@
       <w:pPr>
         <w:numPr>
           <w:ilvl w:val="0"/>
-          <w:numId w:val="1018"/>
+          <w:numId w:val="1019"/>
         </w:numPr>
         <w:pStyle w:val="Compact"/>
       </w:pPr>
@@ -3325,8 +3471,8 @@
         </w:pict>
       </w:r>
     </w:p>
-    <w:bookmarkEnd w:id="40"/>
-    <w:bookmarkStart w:id="41" w:name="X02cdfe8810a6898cbafb1e54c4aabcae3f854ee"/>
+    <w:bookmarkEnd w:id="41"/>
+    <w:bookmarkStart w:id="42" w:name="X02cdfe8810a6898cbafb1e54c4aabcae3f854ee"/>
     <w:p>
       <w:pPr>
         <w:pStyle w:val="Heading2"/>
@@ -3731,8 +3877,8 @@
         </w:pict>
       </w:r>
     </w:p>
-    <w:bookmarkEnd w:id="41"/>
-    <w:bookmarkStart w:id="42" w:name="X3f1e1fc4ea01a8d00e98e49c110b8d66a5262cd"/>
+    <w:bookmarkEnd w:id="42"/>
+    <w:bookmarkStart w:id="43" w:name="X3f1e1fc4ea01a8d00e98e49c110b8d66a5262cd"/>
     <w:p>
       <w:pPr>
         <w:pStyle w:val="Heading2"/>
@@ -3745,7 +3891,7 @@
       <w:pPr>
         <w:numPr>
           <w:ilvl w:val="0"/>
-          <w:numId w:val="1019"/>
+          <w:numId w:val="1020"/>
         </w:numPr>
         <w:pStyle w:val="Compact"/>
       </w:pPr>
@@ -3767,7 +3913,7 @@
       <w:pPr>
         <w:numPr>
           <w:ilvl w:val="0"/>
-          <w:numId w:val="1019"/>
+          <w:numId w:val="1020"/>
         </w:numPr>
         <w:pStyle w:val="Compact"/>
       </w:pPr>
@@ -3786,7 +3932,7 @@
       <w:pPr>
         <w:numPr>
           <w:ilvl w:val="0"/>
-          <w:numId w:val="1019"/>
+          <w:numId w:val="1020"/>
         </w:numPr>
         <w:pStyle w:val="Compact"/>
       </w:pPr>
@@ -3819,8 +3965,8 @@
         </w:pict>
       </w:r>
     </w:p>
-    <w:bookmarkEnd w:id="42"/>
-    <w:bookmarkStart w:id="43" w:name="X3437cd24dc9839307eea4e9cd81ebc8328e1db8"/>
+    <w:bookmarkEnd w:id="43"/>
+    <w:bookmarkStart w:id="44" w:name="X3437cd24dc9839307eea4e9cd81ebc8328e1db8"/>
     <w:p>
       <w:pPr>
         <w:pStyle w:val="Heading2"/>
@@ -3833,7 +3979,7 @@
       <w:pPr>
         <w:numPr>
           <w:ilvl w:val="0"/>
-          <w:numId w:val="1020"/>
+          <w:numId w:val="1021"/>
         </w:numPr>
         <w:pStyle w:val="Compact"/>
       </w:pPr>
@@ -3855,7 +4001,7 @@
       <w:pPr>
         <w:numPr>
           <w:ilvl w:val="0"/>
-          <w:numId w:val="1020"/>
+          <w:numId w:val="1021"/>
         </w:numPr>
         <w:pStyle w:val="Compact"/>
       </w:pPr>
@@ -3892,7 +4038,7 @@
       <w:pPr>
         <w:numPr>
           <w:ilvl w:val="0"/>
-          <w:numId w:val="1020"/>
+          <w:numId w:val="1021"/>
         </w:numPr>
         <w:pStyle w:val="Compact"/>
       </w:pPr>
@@ -3911,7 +4057,7 @@
       <w:pPr>
         <w:numPr>
           <w:ilvl w:val="0"/>
-          <w:numId w:val="1020"/>
+          <w:numId w:val="1021"/>
         </w:numPr>
         <w:pStyle w:val="Compact"/>
       </w:pPr>
@@ -3939,7 +4085,7 @@
       <w:pPr>
         <w:numPr>
           <w:ilvl w:val="0"/>
-          <w:numId w:val="1020"/>
+          <w:numId w:val="1021"/>
         </w:numPr>
         <w:pStyle w:val="Compact"/>
       </w:pPr>
@@ -4006,7 +4152,7 @@
       <w:pPr>
         <w:numPr>
           <w:ilvl w:val="0"/>
-          <w:numId w:val="1020"/>
+          <w:numId w:val="1021"/>
         </w:numPr>
         <w:pStyle w:val="Compact"/>
       </w:pPr>
@@ -4124,7 +4270,7 @@
       <w:pPr>
         <w:numPr>
           <w:ilvl w:val="0"/>
-          <w:numId w:val="1020"/>
+          <w:numId w:val="1021"/>
         </w:numPr>
         <w:pStyle w:val="Compact"/>
       </w:pPr>
@@ -4161,7 +4307,7 @@
       <w:pPr>
         <w:numPr>
           <w:ilvl w:val="0"/>
-          <w:numId w:val="1020"/>
+          <w:numId w:val="1021"/>
         </w:numPr>
         <w:pStyle w:val="Compact"/>
       </w:pPr>
@@ -4198,7 +4344,7 @@
       <w:pPr>
         <w:numPr>
           <w:ilvl w:val="0"/>
-          <w:numId w:val="1020"/>
+          <w:numId w:val="1021"/>
         </w:numPr>
         <w:pStyle w:val="Compact"/>
       </w:pPr>
@@ -4235,7 +4381,7 @@
       <w:pPr>
         <w:numPr>
           <w:ilvl w:val="0"/>
-          <w:numId w:val="1020"/>
+          <w:numId w:val="1021"/>
         </w:numPr>
         <w:pStyle w:val="Compact"/>
       </w:pPr>
@@ -4257,7 +4403,7 @@
       <w:pPr>
         <w:numPr>
           <w:ilvl w:val="0"/>
-          <w:numId w:val="1020"/>
+          <w:numId w:val="1021"/>
         </w:numPr>
         <w:pStyle w:val="Compact"/>
       </w:pPr>
@@ -4309,8 +4455,8 @@
         </w:pict>
       </w:r>
     </w:p>
-    <w:bookmarkEnd w:id="43"/>
-    <w:bookmarkStart w:id="44" w:name="X60ee61aa0b61661ae361e76e4d57ea0756785ea"/>
+    <w:bookmarkEnd w:id="44"/>
+    <w:bookmarkStart w:id="45" w:name="X60ee61aa0b61661ae361e76e4d57ea0756785ea"/>
     <w:p>
       <w:pPr>
         <w:pStyle w:val="Heading2"/>
@@ -4331,7 +4477,7 @@
       <w:pPr>
         <w:numPr>
           <w:ilvl w:val="0"/>
-          <w:numId w:val="1021"/>
+          <w:numId w:val="1022"/>
         </w:numPr>
         <w:pStyle w:val="Compact"/>
       </w:pPr>
@@ -4343,7 +4489,7 @@
       <w:pPr>
         <w:numPr>
           <w:ilvl w:val="0"/>
-          <w:numId w:val="1021"/>
+          <w:numId w:val="1022"/>
         </w:numPr>
         <w:pStyle w:val="Compact"/>
       </w:pPr>
@@ -4367,173 +4513,173 @@
       <w:pPr>
         <w:numPr>
           <w:ilvl w:val="1"/>
+          <w:numId w:val="1023"/>
+        </w:numPr>
+        <w:pStyle w:val="Compact"/>
+      </w:pPr>
+      <w:r>
+        <w:rPr>
+          <w:rStyle w:val="VerbatimChar"/>
+        </w:rPr>
+        <w:t xml:space="preserve">GOOGLE_MAPS_API_KEY</w:t>
+      </w:r>
+      <w:r>
+        <w:t xml:space="preserve">: bật nút Tìm tự động ở địa chỉ. Bật Places API (New) trên Google Cloud. Không có key thì chỉ nhập tay được.</w:t>
+      </w:r>
+    </w:p>
+    <w:p>
+      <w:pPr>
+        <w:numPr>
+          <w:ilvl w:val="1"/>
+          <w:numId w:val="1023"/>
+        </w:numPr>
+        <w:pStyle w:val="Compact"/>
+      </w:pPr>
+      <w:r>
+        <w:rPr>
+          <w:rStyle w:val="VerbatimChar"/>
+        </w:rPr>
+        <w:t xml:space="preserve">SEPAY_API_KEY</w:t>
+      </w:r>
+      <w:r>
+        <w:t xml:space="preserve">: webhook nhận tiền chuyển khoản.</w:t>
+      </w:r>
+    </w:p>
+    <w:p>
+      <w:pPr>
+        <w:numPr>
+          <w:ilvl w:val="1"/>
+          <w:numId w:val="1023"/>
+        </w:numPr>
+        <w:pStyle w:val="Compact"/>
+      </w:pPr>
+      <w:r>
+        <w:rPr>
+          <w:rStyle w:val="VerbatimChar"/>
+        </w:rPr>
+        <w:t xml:space="preserve">VAPID_PUBLIC_KEY</w:t>
+      </w:r>
+      <w:r>
+        <w:t xml:space="preserve">,</w:t>
+      </w:r>
+      <w:r>
+        <w:t xml:space="preserve"> </w:t>
+      </w:r>
+      <w:r>
+        <w:rPr>
+          <w:rStyle w:val="VerbatimChar"/>
+        </w:rPr>
+        <w:t xml:space="preserve">VAPID_PRIVATE_KEY</w:t>
+      </w:r>
+      <w:r>
+        <w:t xml:space="preserve">: thông báo đẩy trên điện thoại. Tạo một lần và không đổi.</w:t>
+      </w:r>
+    </w:p>
+    <w:p>
+      <w:pPr>
+        <w:numPr>
+          <w:ilvl w:val="1"/>
+          <w:numId w:val="1023"/>
+        </w:numPr>
+        <w:pStyle w:val="Compact"/>
+      </w:pPr>
+      <w:r>
+        <w:rPr>
+          <w:rStyle w:val="VerbatimChar"/>
+        </w:rPr>
+        <w:t xml:space="preserve">JWT_EXPIRATION_MS</w:t>
+      </w:r>
+      <w:r>
+        <w:t xml:space="preserve">: thời gian đăng nhập (mặc định 30 ngày).</w:t>
+      </w:r>
+    </w:p>
+    <w:p>
+      <w:pPr>
+        <w:numPr>
+          <w:ilvl w:val="1"/>
+          <w:numId w:val="1023"/>
+        </w:numPr>
+        <w:pStyle w:val="Compact"/>
+      </w:pPr>
+      <w:r>
+        <w:rPr>
+          <w:rStyle w:val="VerbatimChar"/>
+        </w:rPr>
+        <w:t xml:space="preserve">AWS_S3_BUCKET</w:t>
+      </w:r>
+      <w:r>
+        <w:t xml:space="preserve">,</w:t>
+      </w:r>
+      <w:r>
+        <w:t xml:space="preserve"> </w:t>
+      </w:r>
+      <w:r>
+        <w:rPr>
+          <w:rStyle w:val="VerbatimChar"/>
+        </w:rPr>
+        <w:t xml:space="preserve">AWS_ACCESS_KEY</w:t>
+      </w:r>
+      <w:r>
+        <w:t xml:space="preserve">,</w:t>
+      </w:r>
+      <w:r>
+        <w:t xml:space="preserve"> </w:t>
+      </w:r>
+      <w:r>
+        <w:rPr>
+          <w:rStyle w:val="VerbatimChar"/>
+        </w:rPr>
+        <w:t xml:space="preserve">AWS_SECRET_KEY</w:t>
+      </w:r>
+      <w:r>
+        <w:t xml:space="preserve">,</w:t>
+      </w:r>
+      <w:r>
+        <w:t xml:space="preserve"> </w:t>
+      </w:r>
+      <w:r>
+        <w:rPr>
+          <w:rStyle w:val="VerbatimChar"/>
+        </w:rPr>
+        <w:t xml:space="preserve">AWS_CDN_URL</w:t>
+      </w:r>
+      <w:r>
+        <w:t xml:space="preserve">: kho ảnh (ảnh đại diện, ảnh đánh giá).</w:t>
+      </w:r>
+    </w:p>
+    <w:p>
+      <w:pPr>
+        <w:numPr>
+          <w:ilvl w:val="0"/>
           <w:numId w:val="1022"/>
         </w:numPr>
         <w:pStyle w:val="Compact"/>
       </w:pPr>
       <w:r>
-        <w:rPr>
-          <w:rStyle w:val="VerbatimChar"/>
-        </w:rPr>
-        <w:t xml:space="preserve">GOOGLE_MAPS_API_KEY</w:t>
-      </w:r>
-      <w:r>
-        <w:t xml:space="preserve">: bật nút Tìm tự động ở địa chỉ. Bật Places API (New) trên Google Cloud. Không có key thì chỉ nhập tay được.</w:t>
-      </w:r>
-    </w:p>
-    <w:p>
-      <w:pPr>
-        <w:numPr>
-          <w:ilvl w:val="1"/>
+        <w:t xml:space="preserve">Sau mỗi lần cập nhật phiên bản có thêm thuộc tính tìm kiếm: bấm</w:t>
+      </w:r>
+      <w:r>
+        <w:t xml:space="preserve"> </w:t>
+      </w:r>
+      <w:r>
+        <w:rPr>
+          <w:bCs/>
+          <w:b/>
+        </w:rPr>
+        <w:t xml:space="preserve">Cập nhật chỉ mục ngay</w:t>
+      </w:r>
+      <w:r>
+        <w:t xml:space="preserve"> </w:t>
+      </w:r>
+      <w:r>
+        <w:t xml:space="preserve">(mục 8) một lần.</w:t>
+      </w:r>
+    </w:p>
+    <w:p>
+      <w:pPr>
+        <w:numPr>
+          <w:ilvl w:val="0"/>
           <w:numId w:val="1022"/>
-        </w:numPr>
-        <w:pStyle w:val="Compact"/>
-      </w:pPr>
-      <w:r>
-        <w:rPr>
-          <w:rStyle w:val="VerbatimChar"/>
-        </w:rPr>
-        <w:t xml:space="preserve">SEPAY_API_KEY</w:t>
-      </w:r>
-      <w:r>
-        <w:t xml:space="preserve">: webhook nhận tiền chuyển khoản.</w:t>
-      </w:r>
-    </w:p>
-    <w:p>
-      <w:pPr>
-        <w:numPr>
-          <w:ilvl w:val="1"/>
-          <w:numId w:val="1022"/>
-        </w:numPr>
-        <w:pStyle w:val="Compact"/>
-      </w:pPr>
-      <w:r>
-        <w:rPr>
-          <w:rStyle w:val="VerbatimChar"/>
-        </w:rPr>
-        <w:t xml:space="preserve">VAPID_PUBLIC_KEY</w:t>
-      </w:r>
-      <w:r>
-        <w:t xml:space="preserve">,</w:t>
-      </w:r>
-      <w:r>
-        <w:t xml:space="preserve"> </w:t>
-      </w:r>
-      <w:r>
-        <w:rPr>
-          <w:rStyle w:val="VerbatimChar"/>
-        </w:rPr>
-        <w:t xml:space="preserve">VAPID_PRIVATE_KEY</w:t>
-      </w:r>
-      <w:r>
-        <w:t xml:space="preserve">: thông báo đẩy trên điện thoại. Tạo một lần và không đổi.</w:t>
-      </w:r>
-    </w:p>
-    <w:p>
-      <w:pPr>
-        <w:numPr>
-          <w:ilvl w:val="1"/>
-          <w:numId w:val="1022"/>
-        </w:numPr>
-        <w:pStyle w:val="Compact"/>
-      </w:pPr>
-      <w:r>
-        <w:rPr>
-          <w:rStyle w:val="VerbatimChar"/>
-        </w:rPr>
-        <w:t xml:space="preserve">JWT_EXPIRATION_MS</w:t>
-      </w:r>
-      <w:r>
-        <w:t xml:space="preserve">: thời gian đăng nhập (mặc định 30 ngày).</w:t>
-      </w:r>
-    </w:p>
-    <w:p>
-      <w:pPr>
-        <w:numPr>
-          <w:ilvl w:val="1"/>
-          <w:numId w:val="1022"/>
-        </w:numPr>
-        <w:pStyle w:val="Compact"/>
-      </w:pPr>
-      <w:r>
-        <w:rPr>
-          <w:rStyle w:val="VerbatimChar"/>
-        </w:rPr>
-        <w:t xml:space="preserve">AWS_S3_BUCKET</w:t>
-      </w:r>
-      <w:r>
-        <w:t xml:space="preserve">,</w:t>
-      </w:r>
-      <w:r>
-        <w:t xml:space="preserve"> </w:t>
-      </w:r>
-      <w:r>
-        <w:rPr>
-          <w:rStyle w:val="VerbatimChar"/>
-        </w:rPr>
-        <w:t xml:space="preserve">AWS_ACCESS_KEY</w:t>
-      </w:r>
-      <w:r>
-        <w:t xml:space="preserve">,</w:t>
-      </w:r>
-      <w:r>
-        <w:t xml:space="preserve"> </w:t>
-      </w:r>
-      <w:r>
-        <w:rPr>
-          <w:rStyle w:val="VerbatimChar"/>
-        </w:rPr>
-        <w:t xml:space="preserve">AWS_SECRET_KEY</w:t>
-      </w:r>
-      <w:r>
-        <w:t xml:space="preserve">,</w:t>
-      </w:r>
-      <w:r>
-        <w:t xml:space="preserve"> </w:t>
-      </w:r>
-      <w:r>
-        <w:rPr>
-          <w:rStyle w:val="VerbatimChar"/>
-        </w:rPr>
-        <w:t xml:space="preserve">AWS_CDN_URL</w:t>
-      </w:r>
-      <w:r>
-        <w:t xml:space="preserve">: kho ảnh (ảnh đại diện, ảnh đánh giá).</w:t>
-      </w:r>
-    </w:p>
-    <w:p>
-      <w:pPr>
-        <w:numPr>
-          <w:ilvl w:val="0"/>
-          <w:numId w:val="1021"/>
-        </w:numPr>
-        <w:pStyle w:val="Compact"/>
-      </w:pPr>
-      <w:r>
-        <w:t xml:space="preserve">Sau mỗi lần cập nhật phiên bản có thêm thuộc tính tìm kiếm: bấm</w:t>
-      </w:r>
-      <w:r>
-        <w:t xml:space="preserve"> </w:t>
-      </w:r>
-      <w:r>
-        <w:rPr>
-          <w:bCs/>
-          <w:b/>
-        </w:rPr>
-        <w:t xml:space="preserve">Cập nhật chỉ mục ngay</w:t>
-      </w:r>
-      <w:r>
-        <w:t xml:space="preserve"> </w:t>
-      </w:r>
-      <w:r>
-        <w:t xml:space="preserve">(mục 8) một lần.</w:t>
-      </w:r>
-    </w:p>
-    <w:p>
-      <w:pPr>
-        <w:numPr>
-          <w:ilvl w:val="0"/>
-          <w:numId w:val="1021"/>
         </w:numPr>
         <w:pStyle w:val="Compact"/>
       </w:pPr>
@@ -4560,8 +4706,8 @@
         </w:pict>
       </w:r>
     </w:p>
-    <w:bookmarkEnd w:id="44"/>
-    <w:bookmarkStart w:id="45" w:name="X570b34fd4cb419fe086068be77d88f5f3abbb34"/>
+    <w:bookmarkEnd w:id="45"/>
+    <w:bookmarkStart w:id="46" w:name="X570b34fd4cb419fe086068be77d88f5f3abbb34"/>
     <w:p>
       <w:pPr>
         <w:pStyle w:val="Heading2"/>
@@ -5179,8 +5325,8 @@
         </w:pict>
       </w:r>
     </w:p>
-    <w:bookmarkEnd w:id="45"/>
-    <w:bookmarkStart w:id="46" w:name="Xf7b29271aeedbc0b4caa168f1c8d8780af18be7"/>
+    <w:bookmarkEnd w:id="46"/>
+    <w:bookmarkStart w:id="47" w:name="Xf7b29271aeedbc0b4caa168f1c8d8780af18be7"/>
     <w:p>
       <w:pPr>
         <w:pStyle w:val="Heading2"/>
@@ -5219,7 +5365,7 @@
       <w:pPr>
         <w:numPr>
           <w:ilvl w:val="0"/>
-          <w:numId w:val="1023"/>
+          <w:numId w:val="1024"/>
         </w:numPr>
         <w:pStyle w:val="Compact"/>
       </w:pPr>
@@ -5231,7 +5377,7 @@
       <w:pPr>
         <w:numPr>
           <w:ilvl w:val="0"/>
-          <w:numId w:val="1023"/>
+          <w:numId w:val="1024"/>
         </w:numPr>
         <w:pStyle w:val="Compact"/>
       </w:pPr>
@@ -5243,7 +5389,7 @@
       <w:pPr>
         <w:numPr>
           <w:ilvl w:val="0"/>
-          <w:numId w:val="1023"/>
+          <w:numId w:val="1024"/>
         </w:numPr>
         <w:pStyle w:val="Compact"/>
       </w:pPr>
@@ -5255,7 +5401,7 @@
       <w:pPr>
         <w:numPr>
           <w:ilvl w:val="0"/>
-          <w:numId w:val="1023"/>
+          <w:numId w:val="1024"/>
         </w:numPr>
         <w:pStyle w:val="Compact"/>
       </w:pPr>
@@ -5267,7 +5413,7 @@
       <w:pPr>
         <w:numPr>
           <w:ilvl w:val="0"/>
-          <w:numId w:val="1023"/>
+          <w:numId w:val="1024"/>
         </w:numPr>
         <w:pStyle w:val="Compact"/>
       </w:pPr>
@@ -5310,8 +5456,8 @@
         <w:t xml:space="preserve">ở gốc dự án ghi quy tắc cập nhật.</w:t>
       </w:r>
     </w:p>
-    <w:bookmarkEnd w:id="46"/>
     <w:bookmarkEnd w:id="47"/>
+    <w:bookmarkEnd w:id="48"/>
     <w:sectPr/>
   </w:body>
 </w:document>
@@ -5622,21 +5768,6 @@
     <w:abstractNumId w:val="991"/>
   </w:num>
   <w:num w:numId="1005">
-    <w:abstractNumId w:val="991"/>
-  </w:num>
-  <w:num w:numId="1006">
-    <w:abstractNumId w:val="991"/>
-  </w:num>
-  <w:num w:numId="1007">
-    <w:abstractNumId w:val="991"/>
-  </w:num>
-  <w:num w:numId="1008">
-    <w:abstractNumId w:val="991"/>
-  </w:num>
-  <w:num w:numId="1009">
-    <w:abstractNumId w:val="991"/>
-  </w:num>
-  <w:num w:numId="1010">
     <w:abstractNumId w:val="99411"/>
     <w:lvlOverride w:ilvl="0">
       <w:startOverride w:val="1"/>
@@ -5666,10 +5797,22 @@
       <w:startOverride w:val="1"/>
     </w:lvlOverride>
   </w:num>
-  <w:num w:numId="1011">
+  <w:num w:numId="1006">
     <w:abstractNumId w:val="991"/>
   </w:num>
-  <w:num w:numId="1012">
+  <w:num w:numId="1007">
+    <w:abstractNumId w:val="991"/>
+  </w:num>
+  <w:num w:numId="1008">
+    <w:abstractNumId w:val="991"/>
+  </w:num>
+  <w:num w:numId="1009">
+    <w:abstractNumId w:val="991"/>
+  </w:num>
+  <w:num w:numId="1010">
+    <w:abstractNumId w:val="991"/>
+  </w:num>
+  <w:num w:numId="1011">
     <w:abstractNumId w:val="99411"/>
     <w:lvlOverride w:ilvl="0">
       <w:startOverride w:val="1"/>
@@ -5699,8 +5842,38 @@
       <w:startOverride w:val="1"/>
     </w:lvlOverride>
   </w:num>
+  <w:num w:numId="1012">
+    <w:abstractNumId w:val="991"/>
+  </w:num>
   <w:num w:numId="1013">
-    <w:abstractNumId w:val="991"/>
+    <w:abstractNumId w:val="99411"/>
+    <w:lvlOverride w:ilvl="0">
+      <w:startOverride w:val="1"/>
+    </w:lvlOverride>
+    <w:lvlOverride w:ilvl="1">
+      <w:startOverride w:val="1"/>
+    </w:lvlOverride>
+    <w:lvlOverride w:ilvl="2">
+      <w:startOverride w:val="1"/>
+    </w:lvlOverride>
+    <w:lvlOverride w:ilvl="3">
+      <w:startOverride w:val="1"/>
+    </w:lvlOverride>
+    <w:lvlOverride w:ilvl="4">
+      <w:startOverride w:val="1"/>
+    </w:lvlOverride>
+    <w:lvlOverride w:ilvl="5">
+      <w:startOverride w:val="1"/>
+    </w:lvlOverride>
+    <w:lvlOverride w:ilvl="6">
+      <w:startOverride w:val="1"/>
+    </w:lvlOverride>
+    <w:lvlOverride w:ilvl="7">
+      <w:startOverride w:val="1"/>
+    </w:lvlOverride>
+    <w:lvlOverride w:ilvl="8">
+      <w:startOverride w:val="1"/>
+    </w:lvlOverride>
   </w:num>
   <w:num w:numId="1014">
     <w:abstractNumId w:val="991"/>
@@ -5730,6 +5903,9 @@
     <w:abstractNumId w:val="991"/>
   </w:num>
   <w:num w:numId="1023">
+    <w:abstractNumId w:val="991"/>
+  </w:num>
+  <w:num w:numId="1024">
     <w:abstractNumId w:val="99411"/>
     <w:lvlOverride w:ilvl="0">
       <w:startOverride w:val="1"/>

</xml_diff>

<commit_message>
count open course requests and price reports until their final status
Co-Authored-By: Claude Sonnet 5.5 <noreply@anthropic.com>
Claude-Session: https://claude.ai/code/session_01GT1iSHHmvFshTbyK6CNNWv
</commit_message>
<xml_diff>
--- a/docs/huong-dan-admin.docx
+++ b/docs/huong-dan-admin.docx
@@ -4247,7 +4247,7 @@
         <w:t xml:space="preserve"> </w:t>
       </w:r>
       <w:r>
-        <w:t xml:space="preserve">(yêu cầu mới) và</w:t>
+        <w:t xml:space="preserve">(mọi yêu cầu chưa ở trạng thái "Đã đóng", gồm mới, đang liên hệ, đã có khóa phù hợp, chưa có đối tác) và</w:t>
       </w:r>
       <w:r>
         <w:t xml:space="preserve"> </w:t>
@@ -4263,7 +4263,7 @@
         <w:t xml:space="preserve"> </w:t>
       </w:r>
       <w:r>
-        <w:t xml:space="preserve">(báo cáo mới) hiện số bản ghi chưa xử lý; số tự cập nhật mỗi phút và mỗi khi chuyển trang. Hết việc thì số biến mất.</w:t>
+        <w:t xml:space="preserve">(mọi báo cáo chưa ở trạng thái cuối "Đã chỉnh giá" hoặc "Không đúng", gồm mới và đang kiểm tra) hiện số bản ghi chưa xử lý xong; số tự cập nhật mỗi phút và mỗi khi chuyển trang. Hết việc thì số biến mất.</w:t>
       </w:r>
     </w:p>
     <w:p>

</xml_diff>